<commit_message>
Minor improvements in CV and resume
</commit_message>
<xml_diff>
--- a/documents/Michael Wester CV.docx
+++ b/documents/Michael Wester CV.docx
@@ -44,7 +44,7 @@
               <w:rPr>
                 <w:rFonts w:asciiTheme="majorHAnsi" w:hAnsiTheme="majorHAnsi" w:cstheme="majorHAnsi"/>
               </w:rPr>
-              <w:t>Grafton</w:t>
+              <w:t>Milwaukee</w:t>
             </w:r>
             <w:r>
               <w:rPr>
@@ -152,7 +152,28 @@
                   <w:rStyle w:val="Hyperlink"/>
                   <w:rFonts w:asciiTheme="majorHAnsi" w:hAnsiTheme="majorHAnsi" w:cstheme="majorHAnsi"/>
                 </w:rPr>
-                <w:t>github.com/mike-wester</w:t>
+                <w:t>GitH</w:t>
+              </w:r>
+              <w:r>
+                <w:rPr>
+                  <w:rStyle w:val="Hyperlink"/>
+                  <w:rFonts w:asciiTheme="majorHAnsi" w:hAnsiTheme="majorHAnsi" w:cstheme="majorHAnsi"/>
+                </w:rPr>
+                <w:t>u</w:t>
+              </w:r>
+              <w:r>
+                <w:rPr>
+                  <w:rStyle w:val="Hyperlink"/>
+                  <w:rFonts w:asciiTheme="majorHAnsi" w:hAnsiTheme="majorHAnsi" w:cstheme="majorHAnsi"/>
+                </w:rPr>
+                <w:t>b</w:t>
+              </w:r>
+              <w:r>
+                <w:rPr>
+                  <w:rStyle w:val="Hyperlink"/>
+                  <w:rFonts w:asciiTheme="majorHAnsi" w:hAnsiTheme="majorHAnsi" w:cstheme="majorHAnsi"/>
+                </w:rPr>
+                <w:t>.com/mike-wester</w:t>
               </w:r>
             </w:hyperlink>
           </w:p>
@@ -186,9 +207,8 @@
           <w:sz w:val="22"/>
           <w:szCs w:val="22"/>
         </w:rPr>
-        <w:t xml:space="preserve">13 years of experience in crafting innovative solutions across various domains. My expertise lies in spearheading the development of greenfield full-stack applications, pioneering new standalone frontend SPAs/PWAs, architecting RESTful APIs, and designing microservice-based backend infrastructures. Additionally, I'm well-versed in the intricacies of </w:t>
-      </w:r>
-      <w:proofErr w:type="spellStart"/>
+        <w:t xml:space="preserve">Senior Software Engineer and Technical Lead with 13+ years of experience building scalable </w:t>
+      </w:r>
       <w:r>
         <w:rPr>
           <w:rFonts w:asciiTheme="majorHAnsi" w:hAnsiTheme="majorHAnsi" w:cstheme="majorHAnsi"/>
@@ -197,9 +217,8 @@
           <w:sz w:val="22"/>
           <w:szCs w:val="22"/>
         </w:rPr>
-        <w:t>microfrontend</w:t>
-      </w:r>
-      <w:proofErr w:type="spellEnd"/>
+        <w:t xml:space="preserve">systems and </w:t>
+      </w:r>
       <w:r>
         <w:rPr>
           <w:rFonts w:asciiTheme="majorHAnsi" w:hAnsiTheme="majorHAnsi" w:cstheme="majorHAnsi"/>
@@ -208,7 +227,47 @@
           <w:sz w:val="22"/>
           <w:szCs w:val="22"/>
         </w:rPr>
-        <w:t>-based architectures, continuously exploring new paradigms to enhance system scalability and flexibility.</w:t>
+        <w:t xml:space="preserve">full-stack </w:t>
+      </w:r>
+      <w:r>
+        <w:rPr>
+          <w:rFonts w:asciiTheme="majorHAnsi" w:hAnsiTheme="majorHAnsi" w:cstheme="majorHAnsi"/>
+          <w:bCs/>
+          <w:color w:val="auto"/>
+          <w:sz w:val="22"/>
+          <w:szCs w:val="22"/>
+        </w:rPr>
+        <w:t xml:space="preserve">enterprise </w:t>
+      </w:r>
+      <w:r>
+        <w:rPr>
+          <w:rFonts w:asciiTheme="majorHAnsi" w:hAnsiTheme="majorHAnsi" w:cstheme="majorHAnsi"/>
+          <w:bCs/>
+          <w:color w:val="auto"/>
+          <w:sz w:val="22"/>
+          <w:szCs w:val="22"/>
+        </w:rPr>
+        <w:t>applications, microservices, SPAs, and cloud-native platforms. Expertise in C#, ASP.</w:t>
+      </w:r>
+      <w:r>
+        <w:rPr>
+          <w:rFonts w:asciiTheme="majorHAnsi" w:hAnsiTheme="majorHAnsi" w:cstheme="majorHAnsi"/>
+          <w:bCs/>
+          <w:color w:val="auto"/>
+          <w:sz w:val="22"/>
+          <w:szCs w:val="22"/>
+        </w:rPr>
+        <w:t>Net</w:t>
+      </w:r>
+      <w:r>
+        <w:rPr>
+          <w:rFonts w:asciiTheme="majorHAnsi" w:hAnsiTheme="majorHAnsi" w:cstheme="majorHAnsi"/>
+          <w:bCs/>
+          <w:color w:val="auto"/>
+          <w:sz w:val="22"/>
+          <w:szCs w:val="22"/>
+        </w:rPr>
+        <w:t>, Angular, TypeScript, REST APIs, Azure, and modern frontend architecture. Proven track record leading engineering teams, modernizing platforms, improving developer productivity, and delivering customer-focused solutions in fast-paced environments.</w:t>
       </w:r>
     </w:p>
     <w:p>
@@ -221,26 +280,206 @@
           <w:right w:val="nil"/>
           <w:between w:val="nil"/>
         </w:pBdr>
-        <w:spacing w:line="276" w:lineRule="auto"/>
-        <w:rPr>
-          <w:rFonts w:asciiTheme="majorHAnsi" w:hAnsiTheme="majorHAnsi" w:cstheme="majorHAnsi"/>
-          <w:bCs/>
-          <w:color w:val="auto"/>
-          <w:sz w:val="22"/>
-          <w:szCs w:val="22"/>
-        </w:rPr>
-      </w:pPr>
-      <w:r>
-        <w:rPr>
-          <w:rFonts w:asciiTheme="majorHAnsi" w:hAnsiTheme="majorHAnsi" w:cstheme="majorHAnsi"/>
-          <w:bCs/>
-          <w:color w:val="auto"/>
-          <w:sz w:val="22"/>
-          <w:szCs w:val="22"/>
-        </w:rPr>
-        <w:t>Throughout my career, I've embraced leadership roles, serving as a mentor and collaborator to inspire teams and drive projects to success. My commitment to SOLID development principles has been instrumental in delivering robust and maintainable codebases, while my proactive approach to integrating Agile methodologies and CI/CD practices ensures efficiency and quality in every project lifecycle.</w:t>
-      </w:r>
-    </w:p>
+        <w:rPr>
+          <w:rFonts w:asciiTheme="majorHAnsi" w:hAnsiTheme="majorHAnsi" w:cstheme="majorHAnsi"/>
+          <w:color w:val="1155CC"/>
+        </w:rPr>
+      </w:pPr>
+      <w:r>
+        <w:rPr>
+          <w:rFonts w:asciiTheme="majorHAnsi" w:hAnsiTheme="majorHAnsi" w:cstheme="majorHAnsi"/>
+          <w:color w:val="1155CC"/>
+        </w:rPr>
+        <w:t>Technologies and Languages</w:t>
+      </w:r>
+    </w:p>
+    <w:p>
+      <w:pPr>
+        <w:numPr>
+          <w:ilvl w:val="0"/>
+          <w:numId w:val="2"/>
+        </w:numPr>
+      </w:pPr>
+      <w:r>
+        <w:rPr>
+          <w:rFonts w:asciiTheme="minorHAnsi" w:hAnsiTheme="minorHAnsi"/>
+          <w:sz w:val="22"/>
+          <w:szCs w:val="22"/>
+        </w:rPr>
+        <w:t>Languages: C#, TypeScript, JavaScript, SQL, HTML5, CSS3</w:t>
+      </w:r>
+    </w:p>
+    <w:p>
+      <w:pPr>
+        <w:numPr>
+          <w:ilvl w:val="0"/>
+          <w:numId w:val="2"/>
+        </w:numPr>
+      </w:pPr>
+      <w:r>
+        <w:rPr>
+          <w:rFonts w:asciiTheme="minorHAnsi" w:hAnsiTheme="minorHAnsi"/>
+          <w:sz w:val="22"/>
+          <w:szCs w:val="22"/>
+        </w:rPr>
+        <w:t xml:space="preserve">Frontend: Angular, React, </w:t>
+      </w:r>
+      <w:proofErr w:type="spellStart"/>
+      <w:r>
+        <w:rPr>
+          <w:rFonts w:asciiTheme="minorHAnsi" w:hAnsiTheme="minorHAnsi"/>
+          <w:sz w:val="22"/>
+          <w:szCs w:val="22"/>
+        </w:rPr>
+        <w:t>RxJS</w:t>
+      </w:r>
+      <w:proofErr w:type="spellEnd"/>
+      <w:r>
+        <w:rPr>
+          <w:rFonts w:asciiTheme="minorHAnsi" w:hAnsiTheme="minorHAnsi"/>
+          <w:sz w:val="22"/>
+          <w:szCs w:val="22"/>
+        </w:rPr>
+        <w:t>, Angular Material, AG Grid, Jest, Jasmine</w:t>
+      </w:r>
+    </w:p>
+    <w:p>
+      <w:pPr>
+        <w:numPr>
+          <w:ilvl w:val="0"/>
+          <w:numId w:val="2"/>
+        </w:numPr>
+      </w:pPr>
+      <w:r>
+        <w:rPr>
+          <w:rFonts w:asciiTheme="minorHAnsi" w:hAnsiTheme="minorHAnsi"/>
+          <w:sz w:val="22"/>
+          <w:szCs w:val="22"/>
+        </w:rPr>
+        <w:t>Backend: ASP.</w:t>
+      </w:r>
+      <w:r>
+        <w:rPr>
+          <w:rFonts w:asciiTheme="minorHAnsi" w:hAnsiTheme="minorHAnsi"/>
+          <w:sz w:val="22"/>
+          <w:szCs w:val="22"/>
+        </w:rPr>
+        <w:t>Net</w:t>
+      </w:r>
+      <w:r>
+        <w:rPr>
+          <w:rFonts w:asciiTheme="minorHAnsi" w:hAnsiTheme="minorHAnsi"/>
+          <w:sz w:val="22"/>
+          <w:szCs w:val="22"/>
+        </w:rPr>
+        <w:t xml:space="preserve"> Core, REST APIs, </w:t>
+      </w:r>
+      <w:proofErr w:type="spellStart"/>
+      <w:r>
+        <w:rPr>
+          <w:rFonts w:asciiTheme="minorHAnsi" w:hAnsiTheme="minorHAnsi"/>
+          <w:sz w:val="22"/>
+          <w:szCs w:val="22"/>
+        </w:rPr>
+        <w:t>GraphQL</w:t>
+      </w:r>
+      <w:proofErr w:type="spellEnd"/>
+      <w:r>
+        <w:rPr>
+          <w:rFonts w:asciiTheme="minorHAnsi" w:hAnsiTheme="minorHAnsi"/>
+          <w:sz w:val="22"/>
+          <w:szCs w:val="22"/>
+        </w:rPr>
+        <w:t>, Entity Framework, Microservices</w:t>
+      </w:r>
+    </w:p>
+    <w:p>
+      <w:pPr>
+        <w:numPr>
+          <w:ilvl w:val="0"/>
+          <w:numId w:val="2"/>
+        </w:numPr>
+      </w:pPr>
+      <w:r>
+        <w:rPr>
+          <w:rFonts w:asciiTheme="minorHAnsi" w:hAnsiTheme="minorHAnsi"/>
+          <w:sz w:val="22"/>
+          <w:szCs w:val="22"/>
+        </w:rPr>
+        <w:t xml:space="preserve">Cloud &amp; DevOps: </w:t>
+      </w:r>
+      <w:r>
+        <w:t xml:space="preserve">Azure, Azure DevOps, AWS, Docker, Kubernetes, GitHub Actions, Azure Pipelines, Jenkins, </w:t>
+      </w:r>
+      <w:proofErr w:type="spellStart"/>
+      <w:r>
+        <w:t>CircleCI</w:t>
+      </w:r>
+      <w:proofErr w:type="spellEnd"/>
+      <w:r>
+        <w:t>, Octopus Deploy</w:t>
+      </w:r>
+    </w:p>
+    <w:p>
+      <w:pPr>
+        <w:numPr>
+          <w:ilvl w:val="0"/>
+          <w:numId w:val="2"/>
+        </w:numPr>
+      </w:pPr>
+      <w:r>
+        <w:rPr>
+          <w:rFonts w:asciiTheme="minorHAnsi" w:hAnsiTheme="minorHAnsi"/>
+          <w:sz w:val="22"/>
+          <w:szCs w:val="22"/>
+        </w:rPr>
+        <w:t>Databases: SQL Server, PostgreSQL, MongoDB, Oracle, Azure SQL</w:t>
+      </w:r>
+    </w:p>
+    <w:p>
+      <w:pPr>
+        <w:numPr>
+          <w:ilvl w:val="0"/>
+          <w:numId w:val="2"/>
+        </w:numPr>
+      </w:pPr>
+      <w:r>
+        <w:rPr>
+          <w:rFonts w:asciiTheme="minorHAnsi" w:hAnsiTheme="minorHAnsi"/>
+          <w:sz w:val="22"/>
+          <w:szCs w:val="22"/>
+        </w:rPr>
+        <w:t>Architecture: SPA/PWA, Microservices, CI/CD, API Design, Distributed</w:t>
+      </w:r>
+      <w:r>
+        <w:rPr>
+          <w:rFonts w:asciiTheme="minorHAnsi" w:hAnsiTheme="minorHAnsi"/>
+          <w:sz w:val="22"/>
+          <w:szCs w:val="22"/>
+        </w:rPr>
+        <w:t xml:space="preserve">, </w:t>
+      </w:r>
+      <w:r>
+        <w:t>Event-Driven architecture</w:t>
+      </w:r>
+    </w:p>
+    <w:p>
+      <w:pPr>
+        <w:numPr>
+          <w:ilvl w:val="0"/>
+          <w:numId w:val="2"/>
+        </w:numPr>
+      </w:pPr>
+      <w:r>
+        <w:rPr>
+          <w:rFonts w:asciiTheme="minorHAnsi" w:hAnsiTheme="minorHAnsi"/>
+          <w:sz w:val="22"/>
+          <w:szCs w:val="22"/>
+        </w:rPr>
+        <w:t>Security: OAuth, OpenID Connect, SSO</w:t>
+      </w:r>
+    </w:p>
+    <w:p/>
     <w:p>
       <w:pPr>
         <w:pStyle w:val="Heading2"/>
@@ -263,8 +502,6 @@
         </w:rPr>
         <w:t>Work Experience</w:t>
       </w:r>
-      <w:bookmarkStart w:id="0" w:name="_5jnocwoa0dvd" w:colFirst="0" w:colLast="0"/>
-      <w:bookmarkEnd w:id="0"/>
     </w:p>
     <w:p>
       <w:pPr>
@@ -283,6 +520,8 @@
           <w:b/>
         </w:rPr>
       </w:pPr>
+      <w:bookmarkStart w:id="0" w:name="_5jnocwoa0dvd" w:colFirst="0" w:colLast="0"/>
+      <w:bookmarkEnd w:id="0"/>
       <w:r>
         <w:rPr>
           <w:rFonts w:asciiTheme="minorHAnsi" w:eastAsia="Calibri" w:hAnsiTheme="minorHAnsi" w:cstheme="minorHAnsi"/>
@@ -368,7 +607,22 @@
           <w:szCs w:val="22"/>
         </w:rPr>
         <w:tab/>
-        <w:t>Greater Milwaukee Area</w:t>
+      </w:r>
+      <w:r>
+        <w:rPr>
+          <w:rFonts w:asciiTheme="majorHAnsi" w:hAnsiTheme="majorHAnsi" w:cstheme="majorHAnsi"/>
+          <w:sz w:val="22"/>
+          <w:szCs w:val="22"/>
+        </w:rPr>
+        <w:t xml:space="preserve">Remote out of </w:t>
+      </w:r>
+      <w:r>
+        <w:rPr>
+          <w:rFonts w:asciiTheme="majorHAnsi" w:hAnsiTheme="majorHAnsi" w:cstheme="majorHAnsi"/>
+          <w:sz w:val="22"/>
+          <w:szCs w:val="22"/>
+        </w:rPr>
+        <w:t>Milwaukee Area</w:t>
       </w:r>
       <w:r>
         <w:rPr>
@@ -414,6 +668,20 @@
         </w:rPr>
         <w:t>Individual Contributor (IC) Full Stack Engineer transitioning logic from role-based access control to attribute-based access control. Subsequently, promoted to Lead Engineer (LE) with the specific objective of conceptualizing and releasing an internal Angular component library.</w:t>
       </w:r>
+    </w:p>
+    <w:p>
+      <w:pPr>
+        <w:tabs>
+          <w:tab w:val="left" w:pos="720"/>
+          <w:tab w:val="left" w:pos="1440"/>
+          <w:tab w:val="left" w:pos="2160"/>
+        </w:tabs>
+        <w:rPr>
+          <w:rFonts w:asciiTheme="majorHAnsi" w:hAnsiTheme="majorHAnsi" w:cstheme="majorHAnsi"/>
+          <w:sz w:val="22"/>
+          <w:szCs w:val="22"/>
+        </w:rPr>
+      </w:pPr>
     </w:p>
     <w:p>
       <w:pPr>
@@ -438,31 +706,7 @@
           <w:sz w:val="22"/>
           <w:szCs w:val="22"/>
         </w:rPr>
-        <w:t>Creation of NPM UX library utilizing</w:t>
-      </w:r>
-      <w:r>
-        <w:rPr>
-          <w:rFonts w:asciiTheme="majorHAnsi" w:hAnsiTheme="majorHAnsi" w:cstheme="majorHAnsi"/>
-          <w:sz w:val="22"/>
-          <w:szCs w:val="22"/>
-        </w:rPr>
-        <w:t xml:space="preserve"> Angular Materials and AG Grid </w:t>
-      </w:r>
-      <w:r>
-        <w:rPr>
-          <w:rFonts w:asciiTheme="majorHAnsi" w:hAnsiTheme="majorHAnsi" w:cstheme="majorHAnsi"/>
-          <w:sz w:val="22"/>
-          <w:szCs w:val="22"/>
-        </w:rPr>
-        <w:t>for</w:t>
-      </w:r>
-      <w:r>
-        <w:rPr>
-          <w:rFonts w:asciiTheme="majorHAnsi" w:hAnsiTheme="majorHAnsi" w:cstheme="majorHAnsi"/>
-          <w:sz w:val="22"/>
-          <w:szCs w:val="22"/>
-        </w:rPr>
-        <w:t xml:space="preserve"> a more standardized infrastructure.</w:t>
+        <w:t>Managed and mentored a team of 3 engineers, improving delivery consistency and code quality through code reviews, engineering standards, and collaboration with Product Owners on delivery expectations.</w:t>
       </w:r>
     </w:p>
     <w:p>
@@ -488,7 +732,15 @@
           <w:sz w:val="22"/>
           <w:szCs w:val="22"/>
         </w:rPr>
-        <w:t>Implementation/Modification of RESTFul API’s to integrate new access control changes.</w:t>
+        <w:t>Led development of a reusable NPM-based UX component library (Angular Material, AG Grid), improving UI consistency and reducing frontend development time across teams</w:t>
+      </w:r>
+      <w:r>
+        <w:rPr>
+          <w:rFonts w:asciiTheme="majorHAnsi" w:hAnsiTheme="majorHAnsi" w:cstheme="majorHAnsi"/>
+          <w:sz w:val="22"/>
+          <w:szCs w:val="22"/>
+        </w:rPr>
+        <w:t>.</w:t>
       </w:r>
     </w:p>
     <w:p>
@@ -514,7 +766,65 @@
           <w:sz w:val="22"/>
           <w:szCs w:val="22"/>
         </w:rPr>
-        <w:t>Setup/Creation of the initial library project, leveraging AngularCLI to streamline the process.</w:t>
+        <w:t>Implementation</w:t>
+      </w:r>
+      <w:r>
+        <w:rPr>
+          <w:rFonts w:asciiTheme="majorHAnsi" w:hAnsiTheme="majorHAnsi" w:cstheme="majorHAnsi"/>
+          <w:sz w:val="22"/>
+          <w:szCs w:val="22"/>
+        </w:rPr>
+        <w:t>, m</w:t>
+      </w:r>
+      <w:r>
+        <w:rPr>
+          <w:rFonts w:asciiTheme="majorHAnsi" w:hAnsiTheme="majorHAnsi" w:cstheme="majorHAnsi"/>
+          <w:sz w:val="22"/>
+          <w:szCs w:val="22"/>
+        </w:rPr>
+        <w:t>odification</w:t>
+      </w:r>
+      <w:r>
+        <w:rPr>
+          <w:rFonts w:asciiTheme="majorHAnsi" w:hAnsiTheme="majorHAnsi" w:cstheme="majorHAnsi"/>
+          <w:sz w:val="22"/>
+          <w:szCs w:val="22"/>
+        </w:rPr>
+        <w:t xml:space="preserve"> and maintenance</w:t>
+      </w:r>
+      <w:r>
+        <w:rPr>
+          <w:rFonts w:asciiTheme="majorHAnsi" w:hAnsiTheme="majorHAnsi" w:cstheme="majorHAnsi"/>
+          <w:sz w:val="22"/>
+          <w:szCs w:val="22"/>
+        </w:rPr>
+        <w:t xml:space="preserve"> of </w:t>
+      </w:r>
+      <w:proofErr w:type="spellStart"/>
+      <w:r>
+        <w:rPr>
+          <w:rFonts w:asciiTheme="majorHAnsi" w:hAnsiTheme="majorHAnsi" w:cstheme="majorHAnsi"/>
+          <w:sz w:val="22"/>
+          <w:szCs w:val="22"/>
+        </w:rPr>
+        <w:t>RESTfAFul</w:t>
+      </w:r>
+      <w:proofErr w:type="spellEnd"/>
+      <w:r>
+        <w:rPr>
+          <w:rFonts w:asciiTheme="majorHAnsi" w:hAnsiTheme="majorHAnsi" w:cstheme="majorHAnsi"/>
+          <w:sz w:val="22"/>
+          <w:szCs w:val="22"/>
+        </w:rPr>
+        <w:t xml:space="preserve"> APIs</w:t>
+      </w:r>
+      <w:r>
+        <w:rPr>
+          <w:rFonts w:asciiTheme="majorHAnsi" w:hAnsiTheme="majorHAnsi" w:cstheme="majorHAnsi"/>
+          <w:sz w:val="22"/>
+          <w:szCs w:val="22"/>
+        </w:rPr>
+        <w:t xml:space="preserve"> to integrate new access control changes.</w:t>
       </w:r>
     </w:p>
     <w:p>
@@ -525,22 +835,26 @@
         </w:numPr>
         <w:tabs>
           <w:tab w:val="left" w:pos="720"/>
-          <w:tab w:val="left" w:pos="1440"/>
-          <w:tab w:val="left" w:pos="2160"/>
-        </w:tabs>
-        <w:rPr>
-          <w:rFonts w:asciiTheme="majorHAnsi" w:hAnsiTheme="majorHAnsi" w:cstheme="majorHAnsi"/>
-          <w:sz w:val="22"/>
-          <w:szCs w:val="22"/>
-        </w:rPr>
-      </w:pPr>
-      <w:r>
-        <w:rPr>
-          <w:rFonts w:asciiTheme="majorHAnsi" w:hAnsiTheme="majorHAnsi" w:cstheme="majorHAnsi"/>
-          <w:sz w:val="22"/>
-          <w:szCs w:val="22"/>
-        </w:rPr>
-        <w:t>Manage 3 direct reports.</w:t>
+          <w:tab w:val="left" w:pos="-1007"/>
+          <w:tab w:val="left" w:pos="1440"/>
+          <w:tab w:val="left" w:pos="2160"/>
+          <w:tab w:val="center" w:pos="5097"/>
+          <w:tab w:val="left" w:pos="720"/>
+          <w:tab w:val="left" w:pos="1440"/>
+          <w:tab w:val="left" w:pos="2160"/>
+        </w:tabs>
+        <w:rPr>
+          <w:rFonts w:asciiTheme="minorHAnsi" w:eastAsia="Calibri" w:hAnsiTheme="minorHAnsi" w:cstheme="minorHAnsi"/>
+          <w:bCs/>
+        </w:rPr>
+      </w:pPr>
+      <w:r>
+        <w:rPr>
+          <w:rFonts w:asciiTheme="majorHAnsi" w:hAnsiTheme="majorHAnsi" w:cstheme="majorHAnsi"/>
+          <w:sz w:val="22"/>
+          <w:szCs w:val="22"/>
+        </w:rPr>
+        <w:t>Established the foundational Angular CLI project structure and development standards, accelerating onboarding and improving maintainability.</w:t>
       </w:r>
     </w:p>
     <w:p>
@@ -672,7 +986,22 @@
           <w:szCs w:val="22"/>
         </w:rPr>
         <w:tab/>
-        <w:t>Greater Milwaukee Area, WI</w:t>
+      </w:r>
+      <w:r>
+        <w:rPr>
+          <w:rFonts w:asciiTheme="majorHAnsi" w:hAnsiTheme="majorHAnsi" w:cstheme="majorHAnsi"/>
+          <w:sz w:val="22"/>
+          <w:szCs w:val="22"/>
+        </w:rPr>
+        <w:t xml:space="preserve">Remote out of </w:t>
+      </w:r>
+      <w:r>
+        <w:rPr>
+          <w:rFonts w:asciiTheme="majorHAnsi" w:hAnsiTheme="majorHAnsi" w:cstheme="majorHAnsi"/>
+          <w:sz w:val="22"/>
+          <w:szCs w:val="22"/>
+        </w:rPr>
+        <w:t>Milwaukee Area, WI</w:t>
       </w:r>
     </w:p>
     <w:p>
@@ -710,6 +1039,20 @@
         </w:rPr>
         <w:t>IC Full Stack Engineer playing a pivotal role within the new internal Forecasting Engineering initiative. Tasked with developing a green field application aimed at improving our ability to forecast staffing requirements.</w:t>
       </w:r>
+    </w:p>
+    <w:p>
+      <w:pPr>
+        <w:tabs>
+          <w:tab w:val="left" w:pos="720"/>
+          <w:tab w:val="left" w:pos="1440"/>
+          <w:tab w:val="left" w:pos="2160"/>
+        </w:tabs>
+        <w:rPr>
+          <w:rFonts w:asciiTheme="majorHAnsi" w:hAnsiTheme="majorHAnsi" w:cstheme="majorHAnsi"/>
+          <w:sz w:val="22"/>
+          <w:szCs w:val="22"/>
+        </w:rPr>
+      </w:pPr>
     </w:p>
     <w:p>
       <w:pPr>
@@ -734,23 +1077,15 @@
           <w:sz w:val="22"/>
           <w:szCs w:val="22"/>
         </w:rPr>
-        <w:t xml:space="preserve">Automated current reporting process improving end user efficiency by over </w:t>
-      </w:r>
-      <w:r>
-        <w:rPr>
-          <w:rFonts w:asciiTheme="majorHAnsi" w:hAnsiTheme="majorHAnsi" w:cstheme="majorHAnsi"/>
-          <w:sz w:val="22"/>
-          <w:szCs w:val="22"/>
-        </w:rPr>
-        <w:t>500</w:t>
-      </w:r>
-      <w:r>
-        <w:rPr>
-          <w:rFonts w:asciiTheme="majorHAnsi" w:hAnsiTheme="majorHAnsi" w:cstheme="majorHAnsi"/>
-          <w:sz w:val="22"/>
-          <w:szCs w:val="22"/>
-        </w:rPr>
-        <w:t>%.</w:t>
+        <w:t>Automated reporting workflows, increasing end-user efficiency by over 500% and reducing manual processing time</w:t>
+      </w:r>
+      <w:r>
+        <w:rPr>
+          <w:rFonts w:asciiTheme="majorHAnsi" w:hAnsiTheme="majorHAnsi" w:cstheme="majorHAnsi"/>
+          <w:sz w:val="22"/>
+          <w:szCs w:val="22"/>
+        </w:rPr>
+        <w:t>.</w:t>
       </w:r>
     </w:p>
     <w:p>
@@ -776,7 +1111,7 @@
           <w:sz w:val="22"/>
           <w:szCs w:val="22"/>
         </w:rPr>
-        <w:t>Creation/Release of a cutting-edge web application built on React, elevating user experience.</w:t>
+        <w:t>Designed and launched a React-based web application that improved user experience and streamlined forecasting workflows.</w:t>
       </w:r>
     </w:p>
     <w:p>
@@ -818,7 +1153,25 @@
           <w:sz w:val="22"/>
           <w:szCs w:val="22"/>
         </w:rPr>
-        <w:t xml:space="preserve"> GraphQL to enhance efficiency and flexibility in data querying.</w:t>
+        <w:t xml:space="preserve"> </w:t>
+      </w:r>
+      <w:proofErr w:type="spellStart"/>
+      <w:r>
+        <w:rPr>
+          <w:rFonts w:asciiTheme="majorHAnsi" w:hAnsiTheme="majorHAnsi" w:cstheme="majorHAnsi"/>
+          <w:sz w:val="22"/>
+          <w:szCs w:val="22"/>
+        </w:rPr>
+        <w:t>GraphQL</w:t>
+      </w:r>
+      <w:proofErr w:type="spellEnd"/>
+      <w:r>
+        <w:rPr>
+          <w:rFonts w:asciiTheme="majorHAnsi" w:hAnsiTheme="majorHAnsi" w:cstheme="majorHAnsi"/>
+          <w:sz w:val="22"/>
+          <w:szCs w:val="22"/>
+        </w:rPr>
+        <w:t xml:space="preserve"> to enhance efficiency and flexibility in data querying.</w:t>
       </w:r>
     </w:p>
     <w:p>
@@ -834,10 +1187,47 @@
           <w:tab w:val="left" w:pos="2160"/>
         </w:tabs>
         <w:rPr>
+          <w:rFonts w:asciiTheme="majorHAnsi" w:hAnsiTheme="majorHAnsi" w:cstheme="majorHAnsi"/>
+          <w:b/>
+        </w:rPr>
+      </w:pPr>
+      <w:r>
+        <w:rPr>
           <w:rFonts w:asciiTheme="minorHAnsi" w:eastAsia="Calibri" w:hAnsiTheme="minorHAnsi" w:cstheme="minorHAnsi"/>
           <w:bCs/>
         </w:rPr>
-      </w:pPr>
+        <w:lastRenderedPageBreak/>
+        <w:t>Senior Software Engineer</w:t>
+      </w:r>
+      <w:r>
+        <w:rPr>
+          <w:rFonts w:asciiTheme="majorHAnsi" w:hAnsiTheme="majorHAnsi" w:cstheme="majorHAnsi"/>
+          <w:b/>
+        </w:rPr>
+        <w:tab/>
+      </w:r>
+      <w:proofErr w:type="spellStart"/>
+      <w:r>
+        <w:rPr>
+          <w:rFonts w:asciiTheme="majorHAnsi" w:hAnsiTheme="majorHAnsi" w:cstheme="majorHAnsi"/>
+          <w:b/>
+        </w:rPr>
+        <w:t>InvestCloud</w:t>
+      </w:r>
+      <w:proofErr w:type="spellEnd"/>
+      <w:r>
+        <w:rPr>
+          <w:rFonts w:asciiTheme="majorHAnsi" w:hAnsiTheme="majorHAnsi" w:cstheme="majorHAnsi"/>
+        </w:rPr>
+        <w:tab/>
+      </w:r>
+      <w:r>
+        <w:rPr>
+          <w:rFonts w:asciiTheme="majorHAnsi" w:hAnsiTheme="majorHAnsi" w:cstheme="majorHAnsi"/>
+          <w:b/>
+        </w:rPr>
+        <w:t>Jul 2019 – Jun 2020</w:t>
+      </w:r>
     </w:p>
     <w:p>
       <w:pPr>
@@ -853,125 +1243,85 @@
         </w:tabs>
         <w:rPr>
           <w:rFonts w:asciiTheme="majorHAnsi" w:hAnsiTheme="majorHAnsi" w:cstheme="majorHAnsi"/>
-          <w:b/>
-        </w:rPr>
-      </w:pPr>
-      <w:r>
-        <w:rPr>
-          <w:rFonts w:asciiTheme="minorHAnsi" w:eastAsia="Calibri" w:hAnsiTheme="minorHAnsi" w:cstheme="minorHAnsi"/>
-          <w:bCs/>
-        </w:rPr>
-        <w:t>Senior Software Engineer</w:t>
-      </w:r>
-      <w:r>
-        <w:rPr>
-          <w:rFonts w:asciiTheme="majorHAnsi" w:hAnsiTheme="majorHAnsi" w:cstheme="majorHAnsi"/>
-          <w:b/>
+          <w:sz w:val="22"/>
+          <w:szCs w:val="22"/>
+        </w:rPr>
+      </w:pPr>
+      <w:r>
+        <w:rPr>
+          <w:rFonts w:asciiTheme="majorHAnsi" w:hAnsiTheme="majorHAnsi" w:cstheme="majorHAnsi"/>
+          <w:sz w:val="22"/>
+          <w:szCs w:val="22"/>
+        </w:rPr>
+        <w:t>Essentials</w:t>
+      </w:r>
+      <w:r>
+        <w:rPr>
+          <w:rFonts w:asciiTheme="majorHAnsi" w:hAnsiTheme="majorHAnsi" w:cstheme="majorHAnsi"/>
+          <w:sz w:val="22"/>
+          <w:szCs w:val="22"/>
         </w:rPr>
         <w:tab/>
       </w:r>
-      <w:proofErr w:type="spellStart"/>
-      <w:r>
-        <w:rPr>
-          <w:rFonts w:asciiTheme="majorHAnsi" w:hAnsiTheme="majorHAnsi" w:cstheme="majorHAnsi"/>
-          <w:b/>
-        </w:rPr>
-        <w:t>InvestCloud</w:t>
-      </w:r>
-      <w:proofErr w:type="spellEnd"/>
-      <w:r>
-        <w:rPr>
-          <w:rFonts w:asciiTheme="majorHAnsi" w:hAnsiTheme="majorHAnsi" w:cstheme="majorHAnsi"/>
+      <w:r>
+        <w:rPr>
+          <w:rFonts w:asciiTheme="majorHAnsi" w:hAnsiTheme="majorHAnsi" w:cstheme="majorHAnsi"/>
+          <w:sz w:val="22"/>
+          <w:szCs w:val="22"/>
         </w:rPr>
         <w:tab/>
-      </w:r>
-      <w:r>
-        <w:rPr>
-          <w:rFonts w:asciiTheme="majorHAnsi" w:hAnsiTheme="majorHAnsi" w:cstheme="majorHAnsi"/>
-          <w:b/>
-        </w:rPr>
-        <w:t>Jul 2019 – Jun 2020</w:t>
-      </w:r>
-    </w:p>
-    <w:p>
-      <w:pPr>
-        <w:tabs>
-          <w:tab w:val="left" w:pos="720"/>
-          <w:tab w:val="left" w:pos="-1007"/>
-          <w:tab w:val="left" w:pos="4395"/>
-          <w:tab w:val="right" w:pos="10197"/>
-          <w:tab w:val="center" w:pos="5097"/>
-          <w:tab w:val="left" w:pos="720"/>
-          <w:tab w:val="left" w:pos="1440"/>
-          <w:tab w:val="left" w:pos="2160"/>
-        </w:tabs>
-        <w:rPr>
-          <w:rFonts w:asciiTheme="majorHAnsi" w:hAnsiTheme="majorHAnsi" w:cstheme="majorHAnsi"/>
-          <w:sz w:val="22"/>
-          <w:szCs w:val="22"/>
-        </w:rPr>
-      </w:pPr>
-      <w:r>
-        <w:rPr>
-          <w:rFonts w:asciiTheme="majorHAnsi" w:hAnsiTheme="majorHAnsi" w:cstheme="majorHAnsi"/>
-          <w:sz w:val="22"/>
-          <w:szCs w:val="22"/>
-        </w:rPr>
-        <w:t>Essentials</w:t>
-      </w:r>
-      <w:r>
-        <w:rPr>
-          <w:rFonts w:asciiTheme="majorHAnsi" w:hAnsiTheme="majorHAnsi" w:cstheme="majorHAnsi"/>
-          <w:sz w:val="22"/>
-          <w:szCs w:val="22"/>
-        </w:rPr>
-        <w:tab/>
-      </w:r>
-      <w:r>
-        <w:rPr>
-          <w:rFonts w:asciiTheme="majorHAnsi" w:hAnsiTheme="majorHAnsi" w:cstheme="majorHAnsi"/>
-          <w:sz w:val="22"/>
-          <w:szCs w:val="22"/>
-        </w:rPr>
-        <w:tab/>
-        <w:t>Greater Milwaukee Area, WI</w:t>
-      </w:r>
-    </w:p>
-    <w:p>
-      <w:pPr>
-        <w:tabs>
-          <w:tab w:val="left" w:pos="720"/>
-          <w:tab w:val="left" w:pos="1440"/>
-          <w:tab w:val="left" w:pos="2160"/>
-        </w:tabs>
-        <w:rPr>
-          <w:rFonts w:asciiTheme="majorHAnsi" w:hAnsiTheme="majorHAnsi" w:cstheme="majorHAnsi"/>
-          <w:sz w:val="22"/>
-          <w:szCs w:val="22"/>
-        </w:rPr>
-      </w:pPr>
-    </w:p>
-    <w:p>
-      <w:pPr>
-        <w:tabs>
-          <w:tab w:val="left" w:pos="720"/>
-          <w:tab w:val="left" w:pos="1440"/>
-          <w:tab w:val="left" w:pos="2160"/>
-        </w:tabs>
-        <w:rPr>
-          <w:rFonts w:asciiTheme="majorHAnsi" w:hAnsiTheme="majorHAnsi" w:cstheme="majorHAnsi"/>
-          <w:sz w:val="22"/>
-          <w:szCs w:val="22"/>
-        </w:rPr>
-      </w:pPr>
-      <w:r>
-        <w:rPr>
-          <w:rFonts w:asciiTheme="majorHAnsi" w:hAnsiTheme="majorHAnsi" w:cstheme="majorHAnsi"/>
-          <w:sz w:val="22"/>
-          <w:szCs w:val="22"/>
-        </w:rPr>
-        <w:t>IC Full Stack Engineer, I played a pivotal role in the development of a greenfield flagship application, showcasing innovative architecture and leveraging a modern technical stack. Following its market launch, helped lead efforts on the follow-up Essentials initiative.</w:t>
-      </w:r>
+        <w:t>Milwaukee Area, WI</w:t>
+      </w:r>
+    </w:p>
+    <w:p>
+      <w:pPr>
+        <w:tabs>
+          <w:tab w:val="left" w:pos="720"/>
+          <w:tab w:val="left" w:pos="1440"/>
+          <w:tab w:val="left" w:pos="2160"/>
+        </w:tabs>
+        <w:rPr>
+          <w:rFonts w:asciiTheme="majorHAnsi" w:hAnsiTheme="majorHAnsi" w:cstheme="majorHAnsi"/>
+          <w:sz w:val="22"/>
+          <w:szCs w:val="22"/>
+        </w:rPr>
+      </w:pPr>
+    </w:p>
+    <w:p>
+      <w:pPr>
+        <w:tabs>
+          <w:tab w:val="left" w:pos="720"/>
+          <w:tab w:val="left" w:pos="1440"/>
+          <w:tab w:val="left" w:pos="2160"/>
+        </w:tabs>
+        <w:rPr>
+          <w:rFonts w:asciiTheme="majorHAnsi" w:hAnsiTheme="majorHAnsi" w:cstheme="majorHAnsi"/>
+          <w:sz w:val="22"/>
+          <w:szCs w:val="22"/>
+        </w:rPr>
+      </w:pPr>
+      <w:r>
+        <w:rPr>
+          <w:rFonts w:asciiTheme="majorHAnsi" w:hAnsiTheme="majorHAnsi" w:cstheme="majorHAnsi"/>
+          <w:sz w:val="22"/>
+          <w:szCs w:val="22"/>
+        </w:rPr>
+        <w:t xml:space="preserve">IC Full Stack Engineer, I played a pivotal role in the development of a greenfield flagship application, showcasing innovative architecture and leveraging a modern technical stack. </w:t>
+      </w:r>
+    </w:p>
+    <w:p>
+      <w:pPr>
+        <w:tabs>
+          <w:tab w:val="left" w:pos="720"/>
+          <w:tab w:val="left" w:pos="1440"/>
+          <w:tab w:val="left" w:pos="2160"/>
+        </w:tabs>
+        <w:rPr>
+          <w:rFonts w:asciiTheme="majorHAnsi" w:hAnsiTheme="majorHAnsi" w:cstheme="majorHAnsi"/>
+          <w:sz w:val="22"/>
+          <w:szCs w:val="22"/>
+        </w:rPr>
+      </w:pPr>
     </w:p>
     <w:p>
       <w:pPr>
@@ -997,7 +1347,7 @@
           <w:sz w:val="22"/>
           <w:szCs w:val="22"/>
         </w:rPr>
-        <w:t>Utilized Azure Service Bus into our microservices architecture facilitating seamless connection.</w:t>
+        <w:t>Integrated Azure Service Bus into a microservices architecture, improving system communication and scalability.</w:t>
       </w:r>
     </w:p>
     <w:p>
@@ -1080,34 +1430,6 @@
       <w:pPr>
         <w:tabs>
           <w:tab w:val="left" w:pos="720"/>
-          <w:tab w:val="left" w:pos="1440"/>
-          <w:tab w:val="left" w:pos="2160"/>
-        </w:tabs>
-        <w:rPr>
-          <w:rFonts w:asciiTheme="majorHAnsi" w:hAnsiTheme="majorHAnsi" w:cstheme="majorHAnsi"/>
-          <w:sz w:val="22"/>
-          <w:szCs w:val="22"/>
-        </w:rPr>
-      </w:pPr>
-    </w:p>
-    <w:p>
-      <w:pPr>
-        <w:tabs>
-          <w:tab w:val="left" w:pos="720"/>
-          <w:tab w:val="left" w:pos="1440"/>
-          <w:tab w:val="left" w:pos="2160"/>
-        </w:tabs>
-        <w:rPr>
-          <w:rFonts w:asciiTheme="majorHAnsi" w:hAnsiTheme="majorHAnsi" w:cstheme="majorHAnsi"/>
-          <w:sz w:val="22"/>
-          <w:szCs w:val="22"/>
-        </w:rPr>
-      </w:pPr>
-    </w:p>
-    <w:p>
-      <w:pPr>
-        <w:tabs>
-          <w:tab w:val="left" w:pos="720"/>
           <w:tab w:val="left" w:pos="-1007"/>
           <w:tab w:val="left" w:pos="4395"/>
           <w:tab w:val="right" w:pos="10197"/>
@@ -1126,7 +1448,6 @@
           <w:rFonts w:asciiTheme="minorHAnsi" w:eastAsia="Calibri" w:hAnsiTheme="minorHAnsi" w:cstheme="minorHAnsi"/>
           <w:bCs/>
         </w:rPr>
-        <w:lastRenderedPageBreak/>
         <w:t>Team Lead</w:t>
       </w:r>
       <w:r>
@@ -1198,7 +1519,7 @@
           <w:szCs w:val="22"/>
         </w:rPr>
         <w:tab/>
-        <w:t>Greater Milwaukee Area, WI</w:t>
+        <w:t>Milwaukee Area, WI</w:t>
       </w:r>
     </w:p>
     <w:p>
@@ -1236,6 +1557,20 @@
         </w:rPr>
         <w:t>Lead Engineer (LE) of a greenfield initiative, spearheading the effort to replace existing applications with a modern Single Page Application (SPA). Played a pivotal role in delivering a cutting-edge solution to meet our business objectives.</w:t>
       </w:r>
+    </w:p>
+    <w:p>
+      <w:pPr>
+        <w:tabs>
+          <w:tab w:val="left" w:pos="720"/>
+          <w:tab w:val="left" w:pos="1440"/>
+          <w:tab w:val="left" w:pos="2160"/>
+        </w:tabs>
+        <w:rPr>
+          <w:rFonts w:asciiTheme="majorHAnsi" w:hAnsiTheme="majorHAnsi" w:cstheme="majorHAnsi"/>
+          <w:sz w:val="22"/>
+          <w:szCs w:val="22"/>
+        </w:rPr>
+      </w:pPr>
     </w:p>
     <w:p>
       <w:pPr>
@@ -1261,7 +1596,15 @@
           <w:sz w:val="22"/>
           <w:szCs w:val="22"/>
         </w:rPr>
-        <w:t>Introduced Angular animations to elevate the overall user experience.</w:t>
+        <w:t>Owned architecture and development of three C#/.NET microservices supporting a new lending platform, ensuring scalability and reliability</w:t>
+      </w:r>
+      <w:r>
+        <w:rPr>
+          <w:rFonts w:asciiTheme="majorHAnsi" w:hAnsiTheme="majorHAnsi" w:cstheme="majorHAnsi"/>
+          <w:sz w:val="22"/>
+          <w:szCs w:val="22"/>
+        </w:rPr>
+        <w:t>.</w:t>
       </w:r>
     </w:p>
     <w:p>
@@ -1288,39 +1631,7 @@
           <w:sz w:val="22"/>
           <w:szCs w:val="22"/>
         </w:rPr>
-        <w:t xml:space="preserve">Took full ownership </w:t>
-      </w:r>
-      <w:r>
-        <w:rPr>
-          <w:rFonts w:asciiTheme="majorHAnsi" w:hAnsiTheme="majorHAnsi" w:cstheme="majorHAnsi"/>
-          <w:sz w:val="22"/>
-          <w:szCs w:val="22"/>
-        </w:rPr>
-        <w:t>of</w:t>
-      </w:r>
-      <w:r>
-        <w:rPr>
-          <w:rFonts w:asciiTheme="majorHAnsi" w:hAnsiTheme="majorHAnsi" w:cstheme="majorHAnsi"/>
-          <w:sz w:val="22"/>
-          <w:szCs w:val="22"/>
-        </w:rPr>
-        <w:t xml:space="preserve"> three C# .NET backend microservices, overseeing their development and maintenance</w:t>
-      </w:r>
-      <w:r>
-        <w:rPr>
-          <w:rFonts w:asciiTheme="majorHAnsi" w:hAnsiTheme="majorHAnsi" w:cstheme="majorHAnsi"/>
-          <w:sz w:val="22"/>
-          <w:szCs w:val="22"/>
-        </w:rPr>
-        <w:t>.</w:t>
-      </w:r>
-      <w:r>
-        <w:rPr>
-          <w:rFonts w:asciiTheme="majorHAnsi" w:hAnsiTheme="majorHAnsi" w:cstheme="majorHAnsi"/>
-          <w:sz w:val="22"/>
-          <w:szCs w:val="22"/>
-        </w:rPr>
-        <w:t xml:space="preserve"> </w:t>
+        <w:t>Introduced Angular animations to elevate the overall user experience.</w:t>
       </w:r>
     </w:p>
     <w:p>
@@ -1332,45 +1643,9 @@
         </w:numPr>
         <w:tabs>
           <w:tab w:val="left" w:pos="720"/>
-          <w:tab w:val="left" w:pos="1440"/>
-          <w:tab w:val="left" w:pos="2160"/>
-        </w:tabs>
-        <w:rPr>
-          <w:rFonts w:asciiTheme="majorHAnsi" w:hAnsiTheme="majorHAnsi" w:cstheme="majorHAnsi"/>
-          <w:sz w:val="22"/>
-          <w:szCs w:val="22"/>
-        </w:rPr>
-      </w:pPr>
-      <w:r>
-        <w:rPr>
-          <w:rFonts w:asciiTheme="majorHAnsi" w:hAnsiTheme="majorHAnsi" w:cstheme="majorHAnsi"/>
-          <w:sz w:val="22"/>
-          <w:szCs w:val="22"/>
-        </w:rPr>
-        <w:t>Streamlined CI/CD pipeline for an easy development experience</w:t>
-      </w:r>
-    </w:p>
-    <w:p>
-      <w:pPr>
-        <w:tabs>
-          <w:tab w:val="left" w:pos="720"/>
-          <w:tab w:val="left" w:pos="1440"/>
-          <w:tab w:val="left" w:pos="2160"/>
-        </w:tabs>
-        <w:rPr>
-          <w:rFonts w:asciiTheme="majorHAnsi" w:hAnsiTheme="majorHAnsi" w:cstheme="majorHAnsi"/>
-          <w:sz w:val="22"/>
-          <w:szCs w:val="22"/>
-        </w:rPr>
-      </w:pPr>
-    </w:p>
-    <w:p>
-      <w:pPr>
-        <w:tabs>
-          <w:tab w:val="left" w:pos="720"/>
           <w:tab w:val="left" w:pos="-1007"/>
-          <w:tab w:val="left" w:pos="4395"/>
-          <w:tab w:val="right" w:pos="10197"/>
+          <w:tab w:val="left" w:pos="1440"/>
+          <w:tab w:val="left" w:pos="2160"/>
           <w:tab w:val="center" w:pos="5097"/>
           <w:tab w:val="left" w:pos="720"/>
           <w:tab w:val="left" w:pos="1440"/>
@@ -1378,122 +1653,25 @@
         </w:tabs>
         <w:rPr>
           <w:rFonts w:asciiTheme="majorHAnsi" w:hAnsiTheme="majorHAnsi" w:cstheme="majorHAnsi"/>
-          <w:b/>
-        </w:rPr>
-      </w:pPr>
-      <w:r>
-        <w:rPr>
-          <w:rFonts w:asciiTheme="minorHAnsi" w:eastAsia="Calibri" w:hAnsiTheme="minorHAnsi" w:cstheme="minorHAnsi"/>
-          <w:bCs/>
-        </w:rPr>
-        <w:t>Senior Software Engineer</w:t>
-      </w:r>
-      <w:r>
-        <w:rPr>
-          <w:rFonts w:asciiTheme="majorHAnsi" w:hAnsiTheme="majorHAnsi" w:cstheme="majorHAnsi"/>
-          <w:b/>
-        </w:rPr>
-        <w:tab/>
-      </w:r>
-      <w:r>
-        <w:rPr>
-          <w:rFonts w:asciiTheme="majorHAnsi" w:hAnsiTheme="majorHAnsi" w:cstheme="majorHAnsi"/>
-          <w:b/>
-        </w:rPr>
-        <w:t>Blue Yonder</w:t>
-      </w:r>
-      <w:r>
-        <w:rPr>
-          <w:rFonts w:asciiTheme="majorHAnsi" w:hAnsiTheme="majorHAnsi" w:cstheme="majorHAnsi"/>
-        </w:rPr>
-        <w:tab/>
-      </w:r>
-      <w:r>
-        <w:rPr>
-          <w:rFonts w:asciiTheme="majorHAnsi" w:hAnsiTheme="majorHAnsi" w:cstheme="majorHAnsi"/>
-          <w:b/>
-        </w:rPr>
-        <w:t>May 2015 – Mar 2016</w:t>
-      </w:r>
-    </w:p>
-    <w:p>
-      <w:pPr>
-        <w:tabs>
-          <w:tab w:val="left" w:pos="720"/>
-          <w:tab w:val="left" w:pos="-1007"/>
-          <w:tab w:val="left" w:pos="4395"/>
-          <w:tab w:val="right" w:pos="10197"/>
-          <w:tab w:val="center" w:pos="5097"/>
-          <w:tab w:val="left" w:pos="720"/>
-          <w:tab w:val="left" w:pos="1440"/>
-          <w:tab w:val="left" w:pos="2160"/>
-        </w:tabs>
-        <w:rPr>
-          <w:rFonts w:asciiTheme="majorHAnsi" w:hAnsiTheme="majorHAnsi" w:cstheme="majorHAnsi"/>
-          <w:sz w:val="22"/>
-          <w:szCs w:val="22"/>
-        </w:rPr>
-      </w:pPr>
-      <w:r>
-        <w:rPr>
-          <w:rFonts w:asciiTheme="majorHAnsi" w:hAnsiTheme="majorHAnsi" w:cstheme="majorHAnsi"/>
-          <w:sz w:val="22"/>
-          <w:szCs w:val="22"/>
-        </w:rPr>
-        <w:t>Consulting Services</w:t>
-      </w:r>
-      <w:r>
-        <w:rPr>
-          <w:rFonts w:asciiTheme="majorHAnsi" w:hAnsiTheme="majorHAnsi" w:cstheme="majorHAnsi"/>
-          <w:sz w:val="22"/>
-          <w:szCs w:val="22"/>
-        </w:rPr>
-        <w:tab/>
-      </w:r>
-      <w:r>
-        <w:rPr>
-          <w:rFonts w:asciiTheme="majorHAnsi" w:hAnsiTheme="majorHAnsi" w:cstheme="majorHAnsi"/>
-          <w:sz w:val="22"/>
-          <w:szCs w:val="22"/>
-        </w:rPr>
-        <w:tab/>
-        <w:t>Greater Milwaukee Area, WI</w:t>
-      </w:r>
-    </w:p>
-    <w:p>
-      <w:pPr>
-        <w:tabs>
-          <w:tab w:val="left" w:pos="720"/>
-          <w:tab w:val="left" w:pos="1440"/>
-          <w:tab w:val="left" w:pos="2160"/>
-        </w:tabs>
-        <w:rPr>
-          <w:rFonts w:asciiTheme="majorHAnsi" w:hAnsiTheme="majorHAnsi" w:cstheme="majorHAnsi"/>
-          <w:sz w:val="22"/>
-          <w:szCs w:val="22"/>
-        </w:rPr>
-      </w:pPr>
-    </w:p>
-    <w:p>
-      <w:pPr>
-        <w:tabs>
-          <w:tab w:val="left" w:pos="720"/>
-          <w:tab w:val="left" w:pos="1440"/>
-          <w:tab w:val="left" w:pos="2160"/>
-        </w:tabs>
-        <w:rPr>
-          <w:rFonts w:asciiTheme="majorHAnsi" w:hAnsiTheme="majorHAnsi" w:cstheme="majorHAnsi"/>
-          <w:sz w:val="22"/>
-          <w:szCs w:val="22"/>
-        </w:rPr>
-      </w:pPr>
-      <w:r>
-        <w:rPr>
-          <w:rFonts w:asciiTheme="majorHAnsi" w:hAnsiTheme="majorHAnsi" w:cstheme="majorHAnsi"/>
-          <w:sz w:val="22"/>
-          <w:szCs w:val="22"/>
-        </w:rPr>
-        <w:t>Senior Consultant focusing on bridging the identified gaps between our core software platform and customer requirements within the solutions. This involved either implementing customer-specific changes or devising generic solutions to enhance the core product to better meet customer needs.</w:t>
+          <w:sz w:val="22"/>
+          <w:szCs w:val="22"/>
+        </w:rPr>
+      </w:pPr>
+      <w:r>
+        <w:rPr>
+          <w:rFonts w:asciiTheme="majorHAnsi" w:hAnsiTheme="majorHAnsi" w:cstheme="majorHAnsi"/>
+          <w:sz w:val="22"/>
+          <w:szCs w:val="22"/>
+        </w:rPr>
+        <w:t>Redesigned CI/CD pipelines, reducing deployment friction and accelerating release cycles</w:t>
+      </w:r>
+      <w:r>
+        <w:rPr>
+          <w:rFonts w:asciiTheme="majorHAnsi" w:hAnsiTheme="majorHAnsi" w:cstheme="majorHAnsi"/>
+          <w:sz w:val="22"/>
+          <w:szCs w:val="22"/>
+        </w:rPr>
+        <w:t>.</w:t>
       </w:r>
     </w:p>
     <w:p>
@@ -1505,31 +1683,204 @@
         </w:numPr>
         <w:tabs>
           <w:tab w:val="left" w:pos="720"/>
-          <w:tab w:val="left" w:pos="1440"/>
-          <w:tab w:val="left" w:pos="2160"/>
-        </w:tabs>
-        <w:rPr>
-          <w:rFonts w:asciiTheme="majorHAnsi" w:hAnsiTheme="majorHAnsi" w:cstheme="majorHAnsi"/>
-          <w:sz w:val="22"/>
-          <w:szCs w:val="22"/>
-        </w:rPr>
-      </w:pPr>
-      <w:r>
-        <w:rPr>
-          <w:rFonts w:asciiTheme="majorHAnsi" w:hAnsiTheme="majorHAnsi" w:cstheme="majorHAnsi"/>
-          <w:sz w:val="22"/>
-          <w:szCs w:val="22"/>
-        </w:rPr>
-        <w:t>Spearheaded the implementation of Voice enhancements</w:t>
-      </w:r>
-      <w:r>
-        <w:rPr>
-          <w:rFonts w:asciiTheme="majorHAnsi" w:hAnsiTheme="majorHAnsi" w:cstheme="majorHAnsi"/>
-          <w:sz w:val="22"/>
-          <w:szCs w:val="22"/>
-        </w:rPr>
-        <w:t>.</w:t>
-      </w:r>
+          <w:tab w:val="left" w:pos="-1007"/>
+          <w:tab w:val="left" w:pos="1440"/>
+          <w:tab w:val="left" w:pos="2160"/>
+          <w:tab w:val="center" w:pos="5097"/>
+          <w:tab w:val="left" w:pos="720"/>
+          <w:tab w:val="left" w:pos="1440"/>
+          <w:tab w:val="left" w:pos="2160"/>
+        </w:tabs>
+        <w:rPr>
+          <w:rFonts w:asciiTheme="majorHAnsi" w:hAnsiTheme="majorHAnsi" w:cstheme="majorHAnsi"/>
+          <w:sz w:val="22"/>
+          <w:szCs w:val="22"/>
+        </w:rPr>
+      </w:pPr>
+      <w:r>
+        <w:rPr>
+          <w:rFonts w:asciiTheme="majorHAnsi" w:hAnsiTheme="majorHAnsi" w:cstheme="majorHAnsi"/>
+          <w:sz w:val="22"/>
+          <w:szCs w:val="22"/>
+        </w:rPr>
+        <w:t>Modernized legacy applications by replacing unsupported VB6 and Flash components with C# ASP.</w:t>
+      </w:r>
+      <w:r>
+        <w:rPr>
+          <w:rFonts w:asciiTheme="majorHAnsi" w:hAnsiTheme="majorHAnsi" w:cstheme="majorHAnsi"/>
+          <w:sz w:val="22"/>
+          <w:szCs w:val="22"/>
+        </w:rPr>
+        <w:t>Net</w:t>
+      </w:r>
+      <w:r>
+        <w:rPr>
+          <w:rFonts w:asciiTheme="majorHAnsi" w:hAnsiTheme="majorHAnsi" w:cstheme="majorHAnsi"/>
+          <w:sz w:val="22"/>
+          <w:szCs w:val="22"/>
+        </w:rPr>
+        <w:t xml:space="preserve"> solutions.</w:t>
+      </w:r>
+    </w:p>
+    <w:p>
+      <w:pPr>
+        <w:tabs>
+          <w:tab w:val="left" w:pos="720"/>
+          <w:tab w:val="left" w:pos="1440"/>
+          <w:tab w:val="left" w:pos="2160"/>
+        </w:tabs>
+        <w:rPr>
+          <w:rFonts w:asciiTheme="majorHAnsi" w:hAnsiTheme="majorHAnsi" w:cstheme="majorHAnsi"/>
+          <w:sz w:val="22"/>
+          <w:szCs w:val="22"/>
+        </w:rPr>
+      </w:pPr>
+    </w:p>
+    <w:p>
+      <w:pPr>
+        <w:tabs>
+          <w:tab w:val="left" w:pos="720"/>
+          <w:tab w:val="left" w:pos="-1007"/>
+          <w:tab w:val="left" w:pos="4395"/>
+          <w:tab w:val="right" w:pos="10197"/>
+          <w:tab w:val="center" w:pos="5097"/>
+          <w:tab w:val="left" w:pos="720"/>
+          <w:tab w:val="left" w:pos="1440"/>
+          <w:tab w:val="left" w:pos="2160"/>
+        </w:tabs>
+        <w:rPr>
+          <w:rFonts w:asciiTheme="majorHAnsi" w:hAnsiTheme="majorHAnsi" w:cstheme="majorHAnsi"/>
+          <w:b/>
+        </w:rPr>
+      </w:pPr>
+      <w:r>
+        <w:rPr>
+          <w:rFonts w:asciiTheme="minorHAnsi" w:eastAsia="Calibri" w:hAnsiTheme="minorHAnsi" w:cstheme="minorHAnsi"/>
+          <w:bCs/>
+        </w:rPr>
+        <w:t>Senior Software Engineer</w:t>
+      </w:r>
+      <w:r>
+        <w:rPr>
+          <w:rFonts w:asciiTheme="majorHAnsi" w:hAnsiTheme="majorHAnsi" w:cstheme="majorHAnsi"/>
+          <w:b/>
+        </w:rPr>
+        <w:tab/>
+      </w:r>
+      <w:r>
+        <w:rPr>
+          <w:rFonts w:asciiTheme="majorHAnsi" w:hAnsiTheme="majorHAnsi" w:cstheme="majorHAnsi"/>
+          <w:b/>
+        </w:rPr>
+        <w:t>Blue Yonder</w:t>
+      </w:r>
+      <w:r>
+        <w:rPr>
+          <w:rFonts w:asciiTheme="majorHAnsi" w:hAnsiTheme="majorHAnsi" w:cstheme="majorHAnsi"/>
+        </w:rPr>
+        <w:tab/>
+      </w:r>
+      <w:r>
+        <w:rPr>
+          <w:rFonts w:asciiTheme="majorHAnsi" w:hAnsiTheme="majorHAnsi" w:cstheme="majorHAnsi"/>
+          <w:b/>
+        </w:rPr>
+        <w:t>May 2015 – Mar 2016</w:t>
+      </w:r>
+    </w:p>
+    <w:p>
+      <w:pPr>
+        <w:tabs>
+          <w:tab w:val="left" w:pos="720"/>
+          <w:tab w:val="left" w:pos="-1007"/>
+          <w:tab w:val="left" w:pos="4395"/>
+          <w:tab w:val="right" w:pos="10197"/>
+          <w:tab w:val="center" w:pos="5097"/>
+          <w:tab w:val="left" w:pos="720"/>
+          <w:tab w:val="left" w:pos="1440"/>
+          <w:tab w:val="left" w:pos="2160"/>
+        </w:tabs>
+        <w:rPr>
+          <w:rFonts w:asciiTheme="majorHAnsi" w:hAnsiTheme="majorHAnsi" w:cstheme="majorHAnsi"/>
+          <w:sz w:val="22"/>
+          <w:szCs w:val="22"/>
+        </w:rPr>
+      </w:pPr>
+      <w:r>
+        <w:rPr>
+          <w:rFonts w:asciiTheme="majorHAnsi" w:hAnsiTheme="majorHAnsi" w:cstheme="majorHAnsi"/>
+          <w:sz w:val="22"/>
+          <w:szCs w:val="22"/>
+        </w:rPr>
+        <w:t>Consulting Services</w:t>
+      </w:r>
+      <w:r>
+        <w:rPr>
+          <w:rFonts w:asciiTheme="majorHAnsi" w:hAnsiTheme="majorHAnsi" w:cstheme="majorHAnsi"/>
+          <w:sz w:val="22"/>
+          <w:szCs w:val="22"/>
+        </w:rPr>
+        <w:tab/>
+      </w:r>
+      <w:r>
+        <w:rPr>
+          <w:rFonts w:asciiTheme="majorHAnsi" w:hAnsiTheme="majorHAnsi" w:cstheme="majorHAnsi"/>
+          <w:sz w:val="22"/>
+          <w:szCs w:val="22"/>
+        </w:rPr>
+        <w:tab/>
+        <w:t>Greater Milwaukee Area, WI</w:t>
+      </w:r>
+    </w:p>
+    <w:p>
+      <w:pPr>
+        <w:tabs>
+          <w:tab w:val="left" w:pos="720"/>
+          <w:tab w:val="left" w:pos="1440"/>
+          <w:tab w:val="left" w:pos="2160"/>
+        </w:tabs>
+        <w:rPr>
+          <w:rFonts w:asciiTheme="majorHAnsi" w:hAnsiTheme="majorHAnsi" w:cstheme="majorHAnsi"/>
+          <w:sz w:val="22"/>
+          <w:szCs w:val="22"/>
+        </w:rPr>
+      </w:pPr>
+    </w:p>
+    <w:p>
+      <w:pPr>
+        <w:tabs>
+          <w:tab w:val="left" w:pos="720"/>
+          <w:tab w:val="left" w:pos="1440"/>
+          <w:tab w:val="left" w:pos="2160"/>
+        </w:tabs>
+        <w:rPr>
+          <w:rFonts w:asciiTheme="majorHAnsi" w:hAnsiTheme="majorHAnsi" w:cstheme="majorHAnsi"/>
+          <w:sz w:val="22"/>
+          <w:szCs w:val="22"/>
+        </w:rPr>
+      </w:pPr>
+      <w:r>
+        <w:rPr>
+          <w:rFonts w:asciiTheme="majorHAnsi" w:hAnsiTheme="majorHAnsi" w:cstheme="majorHAnsi"/>
+          <w:sz w:val="22"/>
+          <w:szCs w:val="22"/>
+        </w:rPr>
+        <w:t>Senior Consultant focusing on bridging the identified gaps between our core software platform and customer requirements within the solutions. This involved either implementing customer-specific changes or devising generic solutions to enhance the core product to better meet customer needs.</w:t>
+      </w:r>
+    </w:p>
+    <w:p>
+      <w:pPr>
+        <w:tabs>
+          <w:tab w:val="left" w:pos="720"/>
+          <w:tab w:val="left" w:pos="1440"/>
+          <w:tab w:val="left" w:pos="2160"/>
+        </w:tabs>
+        <w:rPr>
+          <w:rFonts w:asciiTheme="majorHAnsi" w:hAnsiTheme="majorHAnsi" w:cstheme="majorHAnsi"/>
+          <w:sz w:val="22"/>
+          <w:szCs w:val="22"/>
+        </w:rPr>
+      </w:pPr>
     </w:p>
     <w:p>
       <w:pPr>
@@ -1555,7 +1906,7 @@
           <w:sz w:val="22"/>
           <w:szCs w:val="22"/>
         </w:rPr>
-        <w:t>Led collaborative efforts with customers directly to understand their unique needs and tailor solutions</w:t>
+        <w:t>Spearheaded the implementation of Voice enhancements</w:t>
       </w:r>
       <w:r>
         <w:rPr>
@@ -1590,7 +1941,7 @@
           <w:sz w:val="22"/>
           <w:szCs w:val="22"/>
         </w:rPr>
-        <w:t>Provided on-site support during critical phases such as kickoff and customer go-live</w:t>
+        <w:t>Led collaborative efforts with customers directly to understand their unique needs and tailor solutions</w:t>
       </w:r>
       <w:r>
         <w:rPr>
@@ -1599,155 +1950,6 @@
           <w:szCs w:val="22"/>
         </w:rPr>
         <w:t>.</w:t>
-      </w:r>
-    </w:p>
-    <w:p>
-      <w:pPr>
-        <w:pStyle w:val="ListParagraph"/>
-        <w:tabs>
-          <w:tab w:val="left" w:pos="720"/>
-          <w:tab w:val="left" w:pos="1440"/>
-          <w:tab w:val="left" w:pos="2160"/>
-        </w:tabs>
-        <w:rPr>
-          <w:rFonts w:asciiTheme="majorHAnsi" w:hAnsiTheme="majorHAnsi" w:cstheme="majorHAnsi"/>
-          <w:sz w:val="22"/>
-          <w:szCs w:val="22"/>
-        </w:rPr>
-      </w:pPr>
-    </w:p>
-    <w:p>
-      <w:pPr>
-        <w:tabs>
-          <w:tab w:val="left" w:pos="720"/>
-          <w:tab w:val="left" w:pos="-1007"/>
-          <w:tab w:val="left" w:pos="4395"/>
-          <w:tab w:val="right" w:pos="10197"/>
-          <w:tab w:val="center" w:pos="5097"/>
-          <w:tab w:val="left" w:pos="720"/>
-          <w:tab w:val="left" w:pos="1440"/>
-          <w:tab w:val="left" w:pos="2160"/>
-        </w:tabs>
-        <w:rPr>
-          <w:rFonts w:asciiTheme="majorHAnsi" w:hAnsiTheme="majorHAnsi" w:cstheme="majorHAnsi"/>
-          <w:b/>
-        </w:rPr>
-      </w:pPr>
-      <w:r>
-        <w:rPr>
-          <w:rFonts w:asciiTheme="minorHAnsi" w:eastAsia="Calibri" w:hAnsiTheme="minorHAnsi" w:cstheme="minorHAnsi"/>
-          <w:bCs/>
-        </w:rPr>
-        <w:t>Software Developer</w:t>
-      </w:r>
-      <w:r>
-        <w:rPr>
-          <w:rFonts w:asciiTheme="majorHAnsi" w:hAnsiTheme="majorHAnsi" w:cstheme="majorHAnsi"/>
-          <w:b/>
-        </w:rPr>
-        <w:tab/>
-      </w:r>
-      <w:proofErr w:type="spellStart"/>
-      <w:r>
-        <w:rPr>
-          <w:rFonts w:asciiTheme="majorHAnsi" w:hAnsiTheme="majorHAnsi" w:cstheme="majorHAnsi"/>
-          <w:b/>
-        </w:rPr>
-        <w:t>Iptor</w:t>
-      </w:r>
-      <w:proofErr w:type="spellEnd"/>
-      <w:r>
-        <w:rPr>
-          <w:rFonts w:asciiTheme="majorHAnsi" w:hAnsiTheme="majorHAnsi" w:cstheme="majorHAnsi"/>
-        </w:rPr>
-        <w:tab/>
-      </w:r>
-      <w:r>
-        <w:rPr>
-          <w:rFonts w:asciiTheme="majorHAnsi" w:hAnsiTheme="majorHAnsi" w:cstheme="majorHAnsi"/>
-          <w:b/>
-        </w:rPr>
-        <w:t>Dec 2013 – May 2015</w:t>
-      </w:r>
-    </w:p>
-    <w:p>
-      <w:pPr>
-        <w:tabs>
-          <w:tab w:val="left" w:pos="720"/>
-          <w:tab w:val="left" w:pos="-1007"/>
-          <w:tab w:val="left" w:pos="4395"/>
-          <w:tab w:val="right" w:pos="10197"/>
-          <w:tab w:val="center" w:pos="5097"/>
-          <w:tab w:val="left" w:pos="720"/>
-          <w:tab w:val="left" w:pos="1440"/>
-          <w:tab w:val="left" w:pos="2160"/>
-        </w:tabs>
-        <w:rPr>
-          <w:rFonts w:asciiTheme="majorHAnsi" w:hAnsiTheme="majorHAnsi" w:cstheme="majorHAnsi"/>
-          <w:sz w:val="22"/>
-          <w:szCs w:val="22"/>
-        </w:rPr>
-      </w:pPr>
-      <w:r>
-        <w:rPr>
-          <w:rFonts w:asciiTheme="majorHAnsi" w:hAnsiTheme="majorHAnsi" w:cstheme="majorHAnsi"/>
-          <w:sz w:val="22"/>
-          <w:szCs w:val="22"/>
-        </w:rPr>
-        <w:t>Dynamin</w:t>
-      </w:r>
-      <w:r>
-        <w:rPr>
-          <w:rFonts w:asciiTheme="majorHAnsi" w:hAnsiTheme="majorHAnsi" w:cstheme="majorHAnsi"/>
-          <w:sz w:val="22"/>
-          <w:szCs w:val="22"/>
-        </w:rPr>
-        <w:tab/>
-      </w:r>
-      <w:r>
-        <w:rPr>
-          <w:rFonts w:asciiTheme="majorHAnsi" w:hAnsiTheme="majorHAnsi" w:cstheme="majorHAnsi"/>
-          <w:sz w:val="22"/>
-          <w:szCs w:val="22"/>
-        </w:rPr>
-        <w:tab/>
-        <w:t>Greater Milwaukee Area, WI</w:t>
-      </w:r>
-    </w:p>
-    <w:p>
-      <w:pPr>
-        <w:tabs>
-          <w:tab w:val="left" w:pos="720"/>
-          <w:tab w:val="left" w:pos="1440"/>
-          <w:tab w:val="left" w:pos="2160"/>
-        </w:tabs>
-        <w:rPr>
-          <w:rFonts w:asciiTheme="majorHAnsi" w:hAnsiTheme="majorHAnsi" w:cstheme="majorHAnsi"/>
-          <w:sz w:val="22"/>
-          <w:szCs w:val="22"/>
-        </w:rPr>
-      </w:pPr>
-    </w:p>
-    <w:p>
-      <w:pPr>
-        <w:tabs>
-          <w:tab w:val="left" w:pos="720"/>
-          <w:tab w:val="left" w:pos="1440"/>
-          <w:tab w:val="left" w:pos="2160"/>
-        </w:tabs>
-        <w:rPr>
-          <w:rFonts w:asciiTheme="majorHAnsi" w:hAnsiTheme="majorHAnsi" w:cstheme="majorHAnsi"/>
-          <w:sz w:val="22"/>
-          <w:szCs w:val="22"/>
-        </w:rPr>
-      </w:pPr>
-      <w:r>
-        <w:rPr>
-          <w:rFonts w:asciiTheme="majorHAnsi" w:hAnsiTheme="majorHAnsi" w:cstheme="majorHAnsi"/>
-          <w:sz w:val="22"/>
-          <w:szCs w:val="22"/>
-        </w:rPr>
-        <w:t>IC Full Stack Engineer, modernizing of our warehouse management application. Working within a team of four engineers, our objective was to transition from a legacy on-prem VB .NET application to a modern AngularJS web-based solution.</w:t>
       </w:r>
     </w:p>
     <w:p>
@@ -1774,8 +1976,172 @@
           <w:sz w:val="22"/>
           <w:szCs w:val="22"/>
         </w:rPr>
-        <w:t>Developed Entity Framework RESTful APIs to facilitate seamless integration ensuring data interoperability.</w:t>
-      </w:r>
+        <w:t>Worked cross team to introduce customer specific enhancements to the core product.</w:t>
+      </w:r>
+    </w:p>
+    <w:p>
+      <w:pPr>
+        <w:pStyle w:val="ListParagraph"/>
+        <w:tabs>
+          <w:tab w:val="left" w:pos="720"/>
+          <w:tab w:val="left" w:pos="1440"/>
+          <w:tab w:val="left" w:pos="2160"/>
+        </w:tabs>
+        <w:rPr>
+          <w:rFonts w:asciiTheme="majorHAnsi" w:hAnsiTheme="majorHAnsi" w:cstheme="majorHAnsi"/>
+          <w:sz w:val="22"/>
+          <w:szCs w:val="22"/>
+        </w:rPr>
+      </w:pPr>
+    </w:p>
+    <w:p>
+      <w:pPr>
+        <w:tabs>
+          <w:tab w:val="left" w:pos="720"/>
+          <w:tab w:val="left" w:pos="-1007"/>
+          <w:tab w:val="left" w:pos="4395"/>
+          <w:tab w:val="right" w:pos="10197"/>
+          <w:tab w:val="center" w:pos="5097"/>
+          <w:tab w:val="left" w:pos="720"/>
+          <w:tab w:val="left" w:pos="1440"/>
+          <w:tab w:val="left" w:pos="2160"/>
+        </w:tabs>
+        <w:rPr>
+          <w:rFonts w:asciiTheme="majorHAnsi" w:hAnsiTheme="majorHAnsi" w:cstheme="majorHAnsi"/>
+          <w:b/>
+        </w:rPr>
+      </w:pPr>
+      <w:r>
+        <w:rPr>
+          <w:rFonts w:asciiTheme="minorHAnsi" w:eastAsia="Calibri" w:hAnsiTheme="minorHAnsi" w:cstheme="minorHAnsi"/>
+          <w:bCs/>
+        </w:rPr>
+        <w:t>Software Developer</w:t>
+      </w:r>
+      <w:r>
+        <w:rPr>
+          <w:rFonts w:asciiTheme="majorHAnsi" w:hAnsiTheme="majorHAnsi" w:cstheme="majorHAnsi"/>
+          <w:b/>
+        </w:rPr>
+        <w:tab/>
+      </w:r>
+      <w:proofErr w:type="spellStart"/>
+      <w:r>
+        <w:rPr>
+          <w:rFonts w:asciiTheme="majorHAnsi" w:hAnsiTheme="majorHAnsi" w:cstheme="majorHAnsi"/>
+          <w:b/>
+        </w:rPr>
+        <w:t>Iptor</w:t>
+      </w:r>
+      <w:proofErr w:type="spellEnd"/>
+      <w:r>
+        <w:rPr>
+          <w:rFonts w:asciiTheme="majorHAnsi" w:hAnsiTheme="majorHAnsi" w:cstheme="majorHAnsi"/>
+        </w:rPr>
+        <w:tab/>
+      </w:r>
+      <w:r>
+        <w:rPr>
+          <w:rFonts w:asciiTheme="majorHAnsi" w:hAnsiTheme="majorHAnsi" w:cstheme="majorHAnsi"/>
+          <w:b/>
+        </w:rPr>
+        <w:t>Dec 2013 – May 2015</w:t>
+      </w:r>
+    </w:p>
+    <w:p>
+      <w:pPr>
+        <w:tabs>
+          <w:tab w:val="left" w:pos="720"/>
+          <w:tab w:val="left" w:pos="-1007"/>
+          <w:tab w:val="left" w:pos="4395"/>
+          <w:tab w:val="right" w:pos="10197"/>
+          <w:tab w:val="center" w:pos="5097"/>
+          <w:tab w:val="left" w:pos="720"/>
+          <w:tab w:val="left" w:pos="1440"/>
+          <w:tab w:val="left" w:pos="2160"/>
+        </w:tabs>
+        <w:rPr>
+          <w:rFonts w:asciiTheme="majorHAnsi" w:hAnsiTheme="majorHAnsi" w:cstheme="majorHAnsi"/>
+          <w:sz w:val="22"/>
+          <w:szCs w:val="22"/>
+        </w:rPr>
+      </w:pPr>
+      <w:r>
+        <w:rPr>
+          <w:rFonts w:asciiTheme="majorHAnsi" w:hAnsiTheme="majorHAnsi" w:cstheme="majorHAnsi"/>
+          <w:sz w:val="22"/>
+          <w:szCs w:val="22"/>
+        </w:rPr>
+        <w:t>Dynamin</w:t>
+      </w:r>
+      <w:r>
+        <w:rPr>
+          <w:rFonts w:asciiTheme="majorHAnsi" w:hAnsiTheme="majorHAnsi" w:cstheme="majorHAnsi"/>
+          <w:sz w:val="22"/>
+          <w:szCs w:val="22"/>
+        </w:rPr>
+        <w:tab/>
+      </w:r>
+      <w:r>
+        <w:rPr>
+          <w:rFonts w:asciiTheme="majorHAnsi" w:hAnsiTheme="majorHAnsi" w:cstheme="majorHAnsi"/>
+          <w:sz w:val="22"/>
+          <w:szCs w:val="22"/>
+        </w:rPr>
+        <w:tab/>
+        <w:t>Greater Milwaukee Area, WI</w:t>
+      </w:r>
+    </w:p>
+    <w:p>
+      <w:pPr>
+        <w:tabs>
+          <w:tab w:val="left" w:pos="720"/>
+          <w:tab w:val="left" w:pos="1440"/>
+          <w:tab w:val="left" w:pos="2160"/>
+        </w:tabs>
+        <w:rPr>
+          <w:rFonts w:asciiTheme="majorHAnsi" w:hAnsiTheme="majorHAnsi" w:cstheme="majorHAnsi"/>
+          <w:sz w:val="22"/>
+          <w:szCs w:val="22"/>
+        </w:rPr>
+      </w:pPr>
+    </w:p>
+    <w:p>
+      <w:pPr>
+        <w:tabs>
+          <w:tab w:val="left" w:pos="720"/>
+          <w:tab w:val="left" w:pos="1440"/>
+          <w:tab w:val="left" w:pos="2160"/>
+        </w:tabs>
+        <w:rPr>
+          <w:rFonts w:asciiTheme="majorHAnsi" w:hAnsiTheme="majorHAnsi" w:cstheme="majorHAnsi"/>
+          <w:sz w:val="22"/>
+          <w:szCs w:val="22"/>
+        </w:rPr>
+      </w:pPr>
+      <w:r>
+        <w:rPr>
+          <w:rFonts w:asciiTheme="majorHAnsi" w:hAnsiTheme="majorHAnsi" w:cstheme="majorHAnsi"/>
+          <w:sz w:val="22"/>
+          <w:szCs w:val="22"/>
+        </w:rPr>
+        <w:t>IC Full Stack Engineer, modernizing of our warehouse management application. Working within a team of four engineers, our objective was to transition from a legacy on-prem VB .NET application to a modern AngularJS web-based solution.</w:t>
+      </w:r>
+    </w:p>
+    <w:p>
+      <w:pPr>
+        <w:pStyle w:val="ListParagraph"/>
+        <w:tabs>
+          <w:tab w:val="left" w:pos="720"/>
+          <w:tab w:val="left" w:pos="1440"/>
+          <w:tab w:val="left" w:pos="2160"/>
+        </w:tabs>
+        <w:rPr>
+          <w:rFonts w:asciiTheme="majorHAnsi" w:hAnsiTheme="majorHAnsi" w:cstheme="majorHAnsi"/>
+          <w:sz w:val="22"/>
+          <w:szCs w:val="22"/>
+        </w:rPr>
+      </w:pPr>
     </w:p>
     <w:p>
       <w:pPr>
@@ -1801,15 +2167,7 @@
           <w:sz w:val="22"/>
           <w:szCs w:val="22"/>
         </w:rPr>
-        <w:t>Implemented SOAP-based Web Service integration with third-party systems</w:t>
-      </w:r>
-      <w:r>
-        <w:rPr>
-          <w:rFonts w:asciiTheme="majorHAnsi" w:hAnsiTheme="majorHAnsi" w:cstheme="majorHAnsi"/>
-          <w:sz w:val="22"/>
-          <w:szCs w:val="22"/>
-        </w:rPr>
-        <w:t>.</w:t>
+        <w:t>Developed Entity Framework RESTful APIs to facilitate seamless integration ensuring data interoperability.</w:t>
       </w:r>
     </w:p>
     <w:p>
@@ -1836,7 +2194,50 @@
           <w:sz w:val="22"/>
           <w:szCs w:val="22"/>
         </w:rPr>
+        <w:t>Implemented SOAP-based Web Service integration with third-party systems</w:t>
+      </w:r>
+      <w:r>
+        <w:rPr>
+          <w:rFonts w:asciiTheme="majorHAnsi" w:hAnsiTheme="majorHAnsi" w:cstheme="majorHAnsi"/>
+          <w:sz w:val="22"/>
+          <w:szCs w:val="22"/>
+        </w:rPr>
+        <w:t>.</w:t>
+      </w:r>
+    </w:p>
+    <w:p>
+      <w:pPr>
+        <w:pStyle w:val="ListParagraph"/>
+        <w:numPr>
+          <w:ilvl w:val="0"/>
+          <w:numId w:val="1"/>
+        </w:numPr>
+        <w:tabs>
+          <w:tab w:val="left" w:pos="720"/>
+          <w:tab w:val="left" w:pos="1440"/>
+          <w:tab w:val="left" w:pos="2160"/>
+        </w:tabs>
+        <w:rPr>
+          <w:rFonts w:asciiTheme="majorHAnsi" w:hAnsiTheme="majorHAnsi" w:cstheme="majorHAnsi"/>
+          <w:sz w:val="22"/>
+          <w:szCs w:val="22"/>
+        </w:rPr>
+      </w:pPr>
+      <w:r>
+        <w:rPr>
+          <w:rFonts w:asciiTheme="majorHAnsi" w:hAnsiTheme="majorHAnsi" w:cstheme="majorHAnsi"/>
+          <w:sz w:val="22"/>
+          <w:szCs w:val="22"/>
+        </w:rPr>
         <w:t>Led development efforts to separate core applications to introduce new products</w:t>
+      </w:r>
+      <w:r>
+        <w:rPr>
+          <w:rFonts w:asciiTheme="majorHAnsi" w:hAnsiTheme="majorHAnsi" w:cstheme="majorHAnsi"/>
+          <w:sz w:val="22"/>
+          <w:szCs w:val="22"/>
+        </w:rPr>
+        <w:t>.</w:t>
       </w:r>
     </w:p>
     <w:p>
@@ -1992,6 +2393,20 @@
         </w:rPr>
         <w:t>.</w:t>
       </w:r>
+    </w:p>
+    <w:p>
+      <w:pPr>
+        <w:tabs>
+          <w:tab w:val="left" w:pos="720"/>
+          <w:tab w:val="left" w:pos="1440"/>
+          <w:tab w:val="left" w:pos="2160"/>
+        </w:tabs>
+        <w:rPr>
+          <w:rFonts w:asciiTheme="majorHAnsi" w:hAnsiTheme="majorHAnsi" w:cstheme="majorHAnsi"/>
+          <w:sz w:val="22"/>
+          <w:szCs w:val="22"/>
+        </w:rPr>
+      </w:pPr>
     </w:p>
     <w:p>
       <w:pPr>
@@ -2102,160 +2517,7 @@
           <w:rFonts w:asciiTheme="majorHAnsi" w:hAnsiTheme="majorHAnsi" w:cstheme="majorHAnsi"/>
           <w:color w:val="1155CC"/>
         </w:rPr>
-        <w:t>Technologies and Languages</w:t>
-      </w:r>
-    </w:p>
-    <w:p>
-      <w:pPr>
-        <w:numPr>
-          <w:ilvl w:val="0"/>
-          <w:numId w:val="2"/>
-        </w:numPr>
-        <w:rPr>
-          <w:rFonts w:asciiTheme="majorHAnsi" w:hAnsiTheme="majorHAnsi" w:cstheme="majorHAnsi"/>
-          <w:sz w:val="22"/>
-          <w:szCs w:val="22"/>
-        </w:rPr>
-      </w:pPr>
-      <w:r>
-        <w:rPr>
-          <w:rFonts w:asciiTheme="majorHAnsi" w:hAnsiTheme="majorHAnsi" w:cstheme="majorHAnsi"/>
-          <w:sz w:val="22"/>
-          <w:szCs w:val="22"/>
-        </w:rPr>
-        <w:t>Languages: Typescript, C#, Javascript, SQL, HTML, CSS</w:t>
-      </w:r>
-    </w:p>
-    <w:p>
-      <w:pPr>
-        <w:numPr>
-          <w:ilvl w:val="0"/>
-          <w:numId w:val="2"/>
-        </w:numPr>
-        <w:rPr>
-          <w:rFonts w:asciiTheme="majorHAnsi" w:hAnsiTheme="majorHAnsi" w:cstheme="majorHAnsi"/>
-          <w:sz w:val="22"/>
-          <w:szCs w:val="22"/>
-        </w:rPr>
-      </w:pPr>
-      <w:r>
-        <w:rPr>
-          <w:rFonts w:asciiTheme="majorHAnsi" w:hAnsiTheme="majorHAnsi" w:cstheme="majorHAnsi"/>
-          <w:sz w:val="22"/>
-          <w:szCs w:val="22"/>
-        </w:rPr>
-        <w:t>Libraries &amp; Frameworks: Angular, RxJS, Angular Material, .NET, Entity Framwork, Jasmine, Jest</w:t>
-      </w:r>
-      <w:r>
-        <w:rPr>
-          <w:rFonts w:asciiTheme="majorHAnsi" w:hAnsiTheme="majorHAnsi" w:cstheme="majorHAnsi"/>
-          <w:sz w:val="22"/>
-          <w:szCs w:val="22"/>
-        </w:rPr>
-        <w:t>, Material Design</w:t>
-      </w:r>
-    </w:p>
-    <w:p>
-      <w:pPr>
-        <w:numPr>
-          <w:ilvl w:val="0"/>
-          <w:numId w:val="2"/>
-        </w:numPr>
-        <w:rPr>
-          <w:rFonts w:asciiTheme="majorHAnsi" w:hAnsiTheme="majorHAnsi" w:cstheme="majorHAnsi"/>
-          <w:sz w:val="22"/>
-          <w:szCs w:val="22"/>
-        </w:rPr>
-      </w:pPr>
-      <w:r>
-        <w:rPr>
-          <w:rFonts w:asciiTheme="majorHAnsi" w:hAnsiTheme="majorHAnsi" w:cstheme="majorHAnsi"/>
-          <w:sz w:val="22"/>
-          <w:szCs w:val="22"/>
-        </w:rPr>
-        <w:t>Databases: SQL Server, Oracle, Postgres, MongoDB, Microsoft Azure SQL Database</w:t>
-      </w:r>
-    </w:p>
-    <w:p>
-      <w:pPr>
-        <w:numPr>
-          <w:ilvl w:val="0"/>
-          <w:numId w:val="2"/>
-        </w:numPr>
-        <w:rPr>
-          <w:rFonts w:asciiTheme="majorHAnsi" w:hAnsiTheme="majorHAnsi" w:cstheme="majorHAnsi"/>
-          <w:sz w:val="22"/>
-          <w:szCs w:val="22"/>
-        </w:rPr>
-      </w:pPr>
-      <w:r>
-        <w:rPr>
-          <w:rFonts w:asciiTheme="majorHAnsi" w:hAnsiTheme="majorHAnsi" w:cstheme="majorHAnsi"/>
-          <w:sz w:val="22"/>
-          <w:szCs w:val="22"/>
-        </w:rPr>
-        <w:t>Cloud Services: Microsoft Azure, AWS, Google Cloud Platform (GCP)</w:t>
-      </w:r>
-    </w:p>
-    <w:p>
-      <w:pPr>
-        <w:numPr>
-          <w:ilvl w:val="0"/>
-          <w:numId w:val="2"/>
-        </w:numPr>
-        <w:rPr>
-          <w:rFonts w:asciiTheme="majorHAnsi" w:hAnsiTheme="majorHAnsi" w:cstheme="majorHAnsi"/>
-          <w:sz w:val="22"/>
-          <w:szCs w:val="22"/>
-        </w:rPr>
-      </w:pPr>
-      <w:r>
-        <w:rPr>
-          <w:rFonts w:asciiTheme="majorHAnsi" w:hAnsiTheme="majorHAnsi" w:cstheme="majorHAnsi"/>
-          <w:sz w:val="22"/>
-          <w:szCs w:val="22"/>
-        </w:rPr>
-        <w:t>Technologies</w:t>
-      </w:r>
-      <w:r>
-        <w:rPr>
-          <w:rFonts w:asciiTheme="majorHAnsi" w:hAnsiTheme="majorHAnsi" w:cstheme="majorHAnsi"/>
-          <w:sz w:val="22"/>
-          <w:szCs w:val="22"/>
-        </w:rPr>
-        <w:t xml:space="preserve">: Azure Pipelines, AngularCLI, Github Actions, Octopus, Jenkins, Docker, Kubernetes, </w:t>
-      </w:r>
-      <w:proofErr w:type="spellStart"/>
-      <w:r>
-        <w:rPr>
-          <w:rFonts w:asciiTheme="majorHAnsi" w:hAnsiTheme="majorHAnsi" w:cstheme="majorHAnsi"/>
-          <w:sz w:val="22"/>
-          <w:szCs w:val="22"/>
-        </w:rPr>
-        <w:t>CircleCI</w:t>
-      </w:r>
-      <w:proofErr w:type="spellEnd"/>
-    </w:p>
-    <w:p>
-      <w:pPr>
-        <w:pStyle w:val="Heading2"/>
-        <w:pBdr>
-          <w:top w:val="nil"/>
-          <w:left w:val="nil"/>
-          <w:bottom w:val="single" w:sz="8" w:space="2" w:color="1155CC"/>
-          <w:right w:val="nil"/>
-          <w:between w:val="nil"/>
-        </w:pBdr>
-        <w:rPr>
-          <w:rFonts w:asciiTheme="majorHAnsi" w:hAnsiTheme="majorHAnsi" w:cstheme="majorHAnsi"/>
-          <w:color w:val="1155CC"/>
-        </w:rPr>
-      </w:pPr>
-      <w:r>
-        <w:rPr>
-          <w:rFonts w:asciiTheme="majorHAnsi" w:hAnsiTheme="majorHAnsi" w:cstheme="majorHAnsi"/>
-          <w:color w:val="1155CC"/>
-        </w:rPr>
+        <w:lastRenderedPageBreak/>
         <w:t>Education and Certifications</w:t>
       </w:r>
     </w:p>
@@ -4329,6 +4591,18 @@
       <w:contextualSpacing/>
     </w:pPr>
   </w:style>
+  <w:style w:type="character" w:styleId="FollowedHyperlink">
+    <w:name w:val="FollowedHyperlink"/>
+    <w:basedOn w:val="DefaultParagraphFont"/>
+    <w:uiPriority w:val="99"/>
+    <w:semiHidden/>
+    <w:unhideWhenUsed/>
+    <w:rsid w:val="00473EB4"/>
+    <w:rPr>
+      <w:color w:val="800080" w:themeColor="followedHyperlink"/>
+      <w:u w:val="single"/>
+    </w:rPr>
+  </w:style>
 </w:styles>
 </file>
 

</xml_diff>

<commit_message>
Final May draft of Resume
</commit_message>
<xml_diff>
--- a/documents/Michael Wester CV.docx
+++ b/documents/Michael Wester CV.docx
@@ -247,7 +247,7 @@
           <w:sz w:val="22"/>
           <w:szCs w:val="22"/>
         </w:rPr>
-        <w:t>applications, microservices, SPAs, and cloud-native platforms. Expertise in C#, ASP.</w:t>
+        <w:t xml:space="preserve">applications, microservices, SPAs, and cloud-native platforms. Expertise in C#, </w:t>
       </w:r>
       <w:r>
         <w:rPr>
@@ -257,7 +257,7 @@
           <w:sz w:val="22"/>
           <w:szCs w:val="22"/>
         </w:rPr>
-        <w:t>Net</w:t>
+        <w:t>ASP.NET</w:t>
       </w:r>
       <w:r>
         <w:rPr>
@@ -290,7 +290,7 @@
           <w:rFonts w:asciiTheme="majorHAnsi" w:hAnsiTheme="majorHAnsi" w:cstheme="majorHAnsi"/>
           <w:color w:val="1155CC"/>
         </w:rPr>
-        <w:t>Technologies and Languages</w:t>
+        <w:t>Core Technologies</w:t>
       </w:r>
     </w:p>
     <w:p>
@@ -356,7 +356,7 @@
           <w:sz w:val="22"/>
           <w:szCs w:val="22"/>
         </w:rPr>
-        <w:t>Backend: ASP.</w:t>
+        <w:t xml:space="preserve">Backend: </w:t>
       </w:r>
       <w:r>
         <w:rPr>
@@ -364,7 +364,7 @@
           <w:sz w:val="22"/>
           <w:szCs w:val="22"/>
         </w:rPr>
-        <w:t>Net</w:t>
+        <w:t>ASP.NET</w:t>
       </w:r>
       <w:r>
         <w:rPr>
@@ -449,18 +449,7 @@
           <w:sz w:val="22"/>
           <w:szCs w:val="22"/>
         </w:rPr>
-        <w:t>Architecture: SPA/PWA, Microservices, CI/CD, API Design, Distributed</w:t>
-      </w:r>
-      <w:r>
-        <w:rPr>
-          <w:rFonts w:asciiTheme="minorHAnsi" w:hAnsiTheme="minorHAnsi"/>
-          <w:sz w:val="22"/>
-          <w:szCs w:val="22"/>
-        </w:rPr>
-        <w:t xml:space="preserve">, </w:t>
-      </w:r>
-      <w:r>
-        <w:t>Event-Driven architecture</w:t>
+        <w:t xml:space="preserve">Architecture: SPA/PWA, Microservices, CI/CD, API Design, Distributed Systems, Event-Driven Architecture </w:t>
       </w:r>
     </w:p>
     <w:p>
@@ -479,7 +468,6 @@
         <w:t>Security: OAuth, OpenID Connect, SSO</w:t>
       </w:r>
     </w:p>
-    <w:p/>
     <w:p>
       <w:pPr>
         <w:pStyle w:val="Heading2"/>
@@ -527,7 +515,7 @@
           <w:rFonts w:asciiTheme="minorHAnsi" w:eastAsia="Calibri" w:hAnsiTheme="minorHAnsi" w:cstheme="minorHAnsi"/>
           <w:bCs/>
         </w:rPr>
-        <w:t>Software Engineering Team Lead</w:t>
+        <w:t>Team Lead – Full Stack</w:t>
       </w:r>
       <w:r>
         <w:rPr>
@@ -614,23 +602,7 @@
           <w:sz w:val="22"/>
           <w:szCs w:val="22"/>
         </w:rPr>
-        <w:t xml:space="preserve">Remote out of </w:t>
-      </w:r>
-      <w:r>
-        <w:rPr>
-          <w:rFonts w:asciiTheme="majorHAnsi" w:hAnsiTheme="majorHAnsi" w:cstheme="majorHAnsi"/>
-          <w:sz w:val="22"/>
-          <w:szCs w:val="22"/>
-        </w:rPr>
-        <w:t>Milwaukee Area</w:t>
-      </w:r>
-      <w:r>
-        <w:rPr>
-          <w:rFonts w:asciiTheme="majorHAnsi" w:hAnsiTheme="majorHAnsi" w:cstheme="majorHAnsi"/>
-          <w:sz w:val="22"/>
-          <w:szCs w:val="22"/>
-        </w:rPr>
-        <w:t>, WI</w:t>
+        <w:t>Remote | Milwaukee, WI</w:t>
       </w:r>
     </w:p>
     <w:p>
@@ -766,65 +738,7 @@
           <w:sz w:val="22"/>
           <w:szCs w:val="22"/>
         </w:rPr>
-        <w:t>Implementation</w:t>
-      </w:r>
-      <w:r>
-        <w:rPr>
-          <w:rFonts w:asciiTheme="majorHAnsi" w:hAnsiTheme="majorHAnsi" w:cstheme="majorHAnsi"/>
-          <w:sz w:val="22"/>
-          <w:szCs w:val="22"/>
-        </w:rPr>
-        <w:t>, m</w:t>
-      </w:r>
-      <w:r>
-        <w:rPr>
-          <w:rFonts w:asciiTheme="majorHAnsi" w:hAnsiTheme="majorHAnsi" w:cstheme="majorHAnsi"/>
-          <w:sz w:val="22"/>
-          <w:szCs w:val="22"/>
-        </w:rPr>
-        <w:t>odification</w:t>
-      </w:r>
-      <w:r>
-        <w:rPr>
-          <w:rFonts w:asciiTheme="majorHAnsi" w:hAnsiTheme="majorHAnsi" w:cstheme="majorHAnsi"/>
-          <w:sz w:val="22"/>
-          <w:szCs w:val="22"/>
-        </w:rPr>
-        <w:t xml:space="preserve"> and maintenance</w:t>
-      </w:r>
-      <w:r>
-        <w:rPr>
-          <w:rFonts w:asciiTheme="majorHAnsi" w:hAnsiTheme="majorHAnsi" w:cstheme="majorHAnsi"/>
-          <w:sz w:val="22"/>
-          <w:szCs w:val="22"/>
-        </w:rPr>
-        <w:t xml:space="preserve"> of </w:t>
-      </w:r>
-      <w:proofErr w:type="spellStart"/>
-      <w:r>
-        <w:rPr>
-          <w:rFonts w:asciiTheme="majorHAnsi" w:hAnsiTheme="majorHAnsi" w:cstheme="majorHAnsi"/>
-          <w:sz w:val="22"/>
-          <w:szCs w:val="22"/>
-        </w:rPr>
-        <w:t>RESTfAFul</w:t>
-      </w:r>
-      <w:proofErr w:type="spellEnd"/>
-      <w:r>
-        <w:rPr>
-          <w:rFonts w:asciiTheme="majorHAnsi" w:hAnsiTheme="majorHAnsi" w:cstheme="majorHAnsi"/>
-          <w:sz w:val="22"/>
-          <w:szCs w:val="22"/>
-        </w:rPr>
-        <w:t xml:space="preserve"> APIs</w:t>
-      </w:r>
-      <w:r>
-        <w:rPr>
-          <w:rFonts w:asciiTheme="majorHAnsi" w:hAnsiTheme="majorHAnsi" w:cstheme="majorHAnsi"/>
-          <w:sz w:val="22"/>
-          <w:szCs w:val="22"/>
-        </w:rPr>
-        <w:t xml:space="preserve"> to integrate new access control changes.</w:t>
+        <w:t xml:space="preserve">Enhanced and maintained RESTful APIs to support evolving access control and authorization requirements. </w:t>
       </w:r>
     </w:p>
     <w:p>
@@ -901,6 +815,20 @@
       </w:r>
       <w:r>
         <w:rPr>
+          <w:rFonts w:asciiTheme="minorHAnsi" w:eastAsia="Calibri" w:hAnsiTheme="minorHAnsi" w:cstheme="minorHAnsi"/>
+          <w:bCs/>
+        </w:rPr>
+        <w:t xml:space="preserve"> </w:t>
+      </w:r>
+      <w:r>
+        <w:rPr>
+          <w:rFonts w:asciiTheme="minorHAnsi" w:eastAsia="Calibri" w:hAnsiTheme="minorHAnsi" w:cstheme="minorHAnsi"/>
+          <w:bCs/>
+        </w:rPr>
+        <w:t>– Full Stack</w:t>
+      </w:r>
+      <w:r>
+        <w:rPr>
           <w:rFonts w:asciiTheme="majorHAnsi" w:hAnsiTheme="majorHAnsi" w:cstheme="majorHAnsi"/>
           <w:b/>
         </w:rPr>
@@ -993,7 +921,7 @@
           <w:sz w:val="22"/>
           <w:szCs w:val="22"/>
         </w:rPr>
-        <w:t xml:space="preserve">Remote out of </w:t>
+        <w:t xml:space="preserve">Remote | </w:t>
       </w:r>
       <w:r>
         <w:rPr>
@@ -1187,17 +1115,49 @@
           <w:tab w:val="left" w:pos="2160"/>
         </w:tabs>
         <w:rPr>
-          <w:rFonts w:asciiTheme="majorHAnsi" w:hAnsiTheme="majorHAnsi" w:cstheme="majorHAnsi"/>
-          <w:b/>
-        </w:rPr>
-      </w:pPr>
-      <w:r>
-        <w:rPr>
           <w:rFonts w:asciiTheme="minorHAnsi" w:eastAsia="Calibri" w:hAnsiTheme="minorHAnsi" w:cstheme="minorHAnsi"/>
           <w:bCs/>
         </w:rPr>
+      </w:pPr>
+    </w:p>
+    <w:p>
+      <w:pPr>
+        <w:tabs>
+          <w:tab w:val="left" w:pos="720"/>
+          <w:tab w:val="left" w:pos="-1007"/>
+          <w:tab w:val="left" w:pos="4395"/>
+          <w:tab w:val="right" w:pos="10197"/>
+          <w:tab w:val="center" w:pos="5097"/>
+          <w:tab w:val="left" w:pos="720"/>
+          <w:tab w:val="left" w:pos="1440"/>
+          <w:tab w:val="left" w:pos="2160"/>
+        </w:tabs>
+        <w:rPr>
+          <w:rFonts w:asciiTheme="majorHAnsi" w:hAnsiTheme="majorHAnsi" w:cstheme="majorHAnsi"/>
+          <w:b/>
+        </w:rPr>
+      </w:pPr>
+      <w:r>
+        <w:rPr>
+          <w:rFonts w:asciiTheme="minorHAnsi" w:eastAsia="Calibri" w:hAnsiTheme="minorHAnsi" w:cstheme="minorHAnsi"/>
+          <w:bCs/>
+        </w:rPr>
         <w:lastRenderedPageBreak/>
         <w:t>Senior Software Engineer</w:t>
+      </w:r>
+      <w:r>
+        <w:rPr>
+          <w:rFonts w:asciiTheme="minorHAnsi" w:eastAsia="Calibri" w:hAnsiTheme="minorHAnsi" w:cstheme="minorHAnsi"/>
+          <w:bCs/>
+        </w:rPr>
+        <w:t xml:space="preserve"> </w:t>
+      </w:r>
+      <w:r>
+        <w:rPr>
+          <w:rFonts w:asciiTheme="minorHAnsi" w:eastAsia="Calibri" w:hAnsiTheme="minorHAnsi" w:cstheme="minorHAnsi"/>
+          <w:bCs/>
+        </w:rPr>
+        <w:t>– Full Stack</w:t>
       </w:r>
       <w:r>
         <w:rPr>
@@ -1452,6 +1412,20 @@
       </w:r>
       <w:r>
         <w:rPr>
+          <w:rFonts w:asciiTheme="minorHAnsi" w:eastAsia="Calibri" w:hAnsiTheme="minorHAnsi" w:cstheme="minorHAnsi"/>
+          <w:bCs/>
+        </w:rPr>
+        <w:t xml:space="preserve"> </w:t>
+      </w:r>
+      <w:r>
+        <w:rPr>
+          <w:rFonts w:asciiTheme="minorHAnsi" w:eastAsia="Calibri" w:hAnsiTheme="minorHAnsi" w:cstheme="minorHAnsi"/>
+          <w:bCs/>
+        </w:rPr>
+        <w:t>– Full Stack</w:t>
+      </w:r>
+      <w:r>
+        <w:rPr>
           <w:rFonts w:asciiTheme="majorHAnsi" w:hAnsiTheme="majorHAnsi" w:cstheme="majorHAnsi"/>
           <w:b/>
         </w:rPr>
@@ -1703,15 +1677,15 @@
           <w:sz w:val="22"/>
           <w:szCs w:val="22"/>
         </w:rPr>
-        <w:t>Modernized legacy applications by replacing unsupported VB6 and Flash components with C# ASP.</w:t>
-      </w:r>
-      <w:r>
-        <w:rPr>
-          <w:rFonts w:asciiTheme="majorHAnsi" w:hAnsiTheme="majorHAnsi" w:cstheme="majorHAnsi"/>
-          <w:sz w:val="22"/>
-          <w:szCs w:val="22"/>
-        </w:rPr>
-        <w:t>Net</w:t>
+        <w:t xml:space="preserve">Modernized legacy applications by replacing unsupported VB6 and Flash components with C# </w:t>
+      </w:r>
+      <w:r>
+        <w:rPr>
+          <w:rFonts w:asciiTheme="majorHAnsi" w:hAnsiTheme="majorHAnsi" w:cstheme="majorHAnsi"/>
+          <w:sz w:val="22"/>
+          <w:szCs w:val="22"/>
+        </w:rPr>
+        <w:t>ASP.NET</w:t>
       </w:r>
       <w:r>
         <w:rPr>
@@ -1829,7 +1803,7 @@
           <w:szCs w:val="22"/>
         </w:rPr>
         <w:tab/>
-        <w:t>Greater Milwaukee Area, WI</w:t>
+        <w:t>Milwaukee Area, WI</w:t>
       </w:r>
     </w:p>
     <w:p>
@@ -1976,7 +1950,7 @@
           <w:sz w:val="22"/>
           <w:szCs w:val="22"/>
         </w:rPr>
-        <w:t>Worked cross team to introduce customer specific enhancements to the core product.</w:t>
+        <w:t>Collaborated across engineering teams to deliver customer-specific enhancements while maintaining core platform stability.</w:t>
       </w:r>
     </w:p>
     <w:p>
@@ -2020,6 +1994,20 @@
       </w:r>
       <w:r>
         <w:rPr>
+          <w:rFonts w:asciiTheme="minorHAnsi" w:eastAsia="Calibri" w:hAnsiTheme="minorHAnsi" w:cstheme="minorHAnsi"/>
+          <w:bCs/>
+        </w:rPr>
+        <w:t xml:space="preserve"> </w:t>
+      </w:r>
+      <w:r>
+        <w:rPr>
+          <w:rFonts w:asciiTheme="minorHAnsi" w:eastAsia="Calibri" w:hAnsiTheme="minorHAnsi" w:cstheme="minorHAnsi"/>
+          <w:bCs/>
+        </w:rPr>
+        <w:t>– Full Stack</w:t>
+      </w:r>
+      <w:r>
+        <w:rPr>
           <w:rFonts w:asciiTheme="majorHAnsi" w:hAnsiTheme="majorHAnsi" w:cstheme="majorHAnsi"/>
           <w:b/>
         </w:rPr>
@@ -2089,7 +2077,7 @@
           <w:szCs w:val="22"/>
         </w:rPr>
         <w:tab/>
-        <w:t>Greater Milwaukee Area, WI</w:t>
+        <w:t>Milwaukee Area, WI</w:t>
       </w:r>
     </w:p>
     <w:p>
@@ -2167,7 +2155,7 @@
           <w:sz w:val="22"/>
           <w:szCs w:val="22"/>
         </w:rPr>
-        <w:t>Developed Entity Framework RESTful APIs to facilitate seamless integration ensuring data interoperability.</w:t>
+        <w:t xml:space="preserve">Developed RESTful APIs using Entity Framework to support system integrations and improve data interoperability. </w:t>
       </w:r>
     </w:p>
     <w:p>
@@ -2258,6 +2246,104 @@
       <w:pPr>
         <w:tabs>
           <w:tab w:val="left" w:pos="720"/>
+          <w:tab w:val="left" w:pos="1440"/>
+          <w:tab w:val="left" w:pos="2160"/>
+        </w:tabs>
+        <w:rPr>
+          <w:rFonts w:asciiTheme="majorHAnsi" w:hAnsiTheme="majorHAnsi" w:cstheme="majorHAnsi"/>
+          <w:sz w:val="22"/>
+          <w:szCs w:val="22"/>
+        </w:rPr>
+      </w:pPr>
+    </w:p>
+    <w:p>
+      <w:pPr>
+        <w:tabs>
+          <w:tab w:val="left" w:pos="720"/>
+          <w:tab w:val="left" w:pos="1440"/>
+          <w:tab w:val="left" w:pos="2160"/>
+        </w:tabs>
+        <w:rPr>
+          <w:rFonts w:asciiTheme="majorHAnsi" w:hAnsiTheme="majorHAnsi" w:cstheme="majorHAnsi"/>
+          <w:sz w:val="22"/>
+          <w:szCs w:val="22"/>
+        </w:rPr>
+      </w:pPr>
+    </w:p>
+    <w:p>
+      <w:pPr>
+        <w:tabs>
+          <w:tab w:val="left" w:pos="720"/>
+          <w:tab w:val="left" w:pos="1440"/>
+          <w:tab w:val="left" w:pos="2160"/>
+        </w:tabs>
+        <w:rPr>
+          <w:rFonts w:asciiTheme="majorHAnsi" w:hAnsiTheme="majorHAnsi" w:cstheme="majorHAnsi"/>
+          <w:sz w:val="22"/>
+          <w:szCs w:val="22"/>
+        </w:rPr>
+      </w:pPr>
+    </w:p>
+    <w:p>
+      <w:pPr>
+        <w:tabs>
+          <w:tab w:val="left" w:pos="720"/>
+          <w:tab w:val="left" w:pos="1440"/>
+          <w:tab w:val="left" w:pos="2160"/>
+        </w:tabs>
+        <w:rPr>
+          <w:rFonts w:asciiTheme="majorHAnsi" w:hAnsiTheme="majorHAnsi" w:cstheme="majorHAnsi"/>
+          <w:sz w:val="22"/>
+          <w:szCs w:val="22"/>
+        </w:rPr>
+      </w:pPr>
+    </w:p>
+    <w:p>
+      <w:pPr>
+        <w:tabs>
+          <w:tab w:val="left" w:pos="720"/>
+          <w:tab w:val="left" w:pos="1440"/>
+          <w:tab w:val="left" w:pos="2160"/>
+        </w:tabs>
+        <w:rPr>
+          <w:rFonts w:asciiTheme="majorHAnsi" w:hAnsiTheme="majorHAnsi" w:cstheme="majorHAnsi"/>
+          <w:sz w:val="22"/>
+          <w:szCs w:val="22"/>
+        </w:rPr>
+      </w:pPr>
+    </w:p>
+    <w:p>
+      <w:pPr>
+        <w:tabs>
+          <w:tab w:val="left" w:pos="720"/>
+          <w:tab w:val="left" w:pos="1440"/>
+          <w:tab w:val="left" w:pos="2160"/>
+        </w:tabs>
+        <w:rPr>
+          <w:rFonts w:asciiTheme="majorHAnsi" w:hAnsiTheme="majorHAnsi" w:cstheme="majorHAnsi"/>
+          <w:sz w:val="22"/>
+          <w:szCs w:val="22"/>
+        </w:rPr>
+      </w:pPr>
+    </w:p>
+    <w:p>
+      <w:pPr>
+        <w:tabs>
+          <w:tab w:val="left" w:pos="720"/>
+          <w:tab w:val="left" w:pos="1440"/>
+          <w:tab w:val="left" w:pos="2160"/>
+        </w:tabs>
+        <w:rPr>
+          <w:rFonts w:asciiTheme="majorHAnsi" w:hAnsiTheme="majorHAnsi" w:cstheme="majorHAnsi"/>
+          <w:sz w:val="22"/>
+          <w:szCs w:val="22"/>
+        </w:rPr>
+      </w:pPr>
+    </w:p>
+    <w:p>
+      <w:pPr>
+        <w:tabs>
+          <w:tab w:val="left" w:pos="720"/>
           <w:tab w:val="left" w:pos="-1007"/>
           <w:tab w:val="left" w:pos="4395"/>
           <w:tab w:val="right" w:pos="10197"/>
@@ -2276,6 +2362,7 @@
           <w:rFonts w:asciiTheme="minorHAnsi" w:eastAsia="Calibri" w:hAnsiTheme="minorHAnsi" w:cstheme="minorHAnsi"/>
           <w:bCs/>
         </w:rPr>
+        <w:lastRenderedPageBreak/>
         <w:t>Technical Consultant Intermediate</w:t>
       </w:r>
       <w:r>
@@ -2347,7 +2434,30 @@
           <w:szCs w:val="22"/>
         </w:rPr>
         <w:tab/>
-        <w:t>Greater Milwaukee Area, WI</w:t>
+      </w:r>
+      <w:r>
+        <w:rPr>
+          <w:rFonts w:asciiTheme="majorHAnsi" w:hAnsiTheme="majorHAnsi" w:cstheme="majorHAnsi"/>
+          <w:sz w:val="22"/>
+          <w:szCs w:val="22"/>
+        </w:rPr>
+        <w:t xml:space="preserve">Milwaukee, WI  / </w:t>
+      </w:r>
+      <w:r>
+        <w:rPr>
+          <w:rFonts w:asciiTheme="majorHAnsi" w:hAnsiTheme="majorHAnsi" w:cstheme="majorHAnsi"/>
+          <w:sz w:val="22"/>
+          <w:szCs w:val="22"/>
+        </w:rPr>
+        <w:t xml:space="preserve"> </w:t>
+      </w:r>
+      <w:r>
+        <w:rPr>
+          <w:rFonts w:asciiTheme="majorHAnsi" w:hAnsiTheme="majorHAnsi" w:cstheme="majorHAnsi"/>
+          <w:sz w:val="22"/>
+          <w:szCs w:val="22"/>
+        </w:rPr>
+        <w:t>Remote |Denver, CO</w:t>
       </w:r>
     </w:p>
     <w:p>
@@ -2517,7 +2627,6 @@
           <w:rFonts w:asciiTheme="majorHAnsi" w:hAnsiTheme="majorHAnsi" w:cstheme="majorHAnsi"/>
           <w:color w:val="1155CC"/>
         </w:rPr>
-        <w:lastRenderedPageBreak/>
         <w:t>Education and Certifications</w:t>
       </w:r>
     </w:p>

</xml_diff>

<commit_message>
Refactor github resume page with new wording and bullet points
</commit_message>
<xml_diff>
--- a/documents/Michael Wester CV.docx
+++ b/documents/Michael Wester CV.docx
@@ -738,7 +738,7 @@
           <w:sz w:val="22"/>
           <w:szCs w:val="22"/>
         </w:rPr>
-        <w:t xml:space="preserve">Enhanced and maintained RESTful APIs to support evolving access control and authorization requirements. </w:t>
+        <w:t>Enhanced and maintained RESTful APIs to support evolving access control and authorization requirements.</w:t>
       </w:r>
     </w:p>
     <w:p>
@@ -2155,7 +2155,7 @@
           <w:sz w:val="22"/>
           <w:szCs w:val="22"/>
         </w:rPr>
-        <w:t xml:space="preserve">Developed RESTful APIs using Entity Framework to support system integrations and improve data interoperability. </w:t>
+        <w:t>Developed RESTful APIs using Entity Framework to support system integrations and improve data interoperability.</w:t>
       </w:r>
     </w:p>
     <w:p>
@@ -2441,7 +2441,25 @@
           <w:sz w:val="22"/>
           <w:szCs w:val="22"/>
         </w:rPr>
-        <w:t xml:space="preserve">Milwaukee, WI  / </w:t>
+        <w:t xml:space="preserve">Milwaukee, </w:t>
+      </w:r>
+      <w:proofErr w:type="gramStart"/>
+      <w:r>
+        <w:rPr>
+          <w:rFonts w:asciiTheme="majorHAnsi" w:hAnsiTheme="majorHAnsi" w:cstheme="majorHAnsi"/>
+          <w:sz w:val="22"/>
+          <w:szCs w:val="22"/>
+        </w:rPr>
+        <w:t>WI  /</w:t>
+      </w:r>
+      <w:proofErr w:type="gramEnd"/>
+      <w:r>
+        <w:rPr>
+          <w:rFonts w:asciiTheme="majorHAnsi" w:hAnsiTheme="majorHAnsi" w:cstheme="majorHAnsi"/>
+          <w:sz w:val="22"/>
+          <w:szCs w:val="22"/>
+        </w:rPr>
+        <w:t xml:space="preserve"> </w:t>
       </w:r>
       <w:r>
         <w:rPr>
@@ -2728,7 +2746,23 @@
           <w:sz w:val="22"/>
           <w:szCs w:val="22"/>
         </w:rPr>
-        <w:t>2006-</w:t>
+        <w:t>200</w:t>
+      </w:r>
+      <w:r>
+        <w:rPr>
+          <w:rFonts w:asciiTheme="majorHAnsi" w:hAnsiTheme="majorHAnsi" w:cstheme="majorHAnsi"/>
+          <w:sz w:val="22"/>
+          <w:szCs w:val="22"/>
+        </w:rPr>
+        <w:t>5</w:t>
+      </w:r>
+      <w:r>
+        <w:rPr>
+          <w:rFonts w:asciiTheme="majorHAnsi" w:hAnsiTheme="majorHAnsi" w:cstheme="majorHAnsi"/>
+          <w:sz w:val="22"/>
+          <w:szCs w:val="22"/>
+        </w:rPr>
+        <w:t>-</w:t>
       </w:r>
       <w:r>
         <w:rPr>

</xml_diff>

<commit_message>
Update Resume, CV and CL to containt codewars and portfolio
</commit_message>
<xml_diff>
--- a/documents/Michael Wester CV.docx
+++ b/documents/Michael Wester CV.docx
@@ -5,14 +5,15 @@
     <w:tbl>
       <w:tblPr>
         <w:tblStyle w:val="a"/>
-        <w:tblW w:w="10215" w:type="dxa"/>
+        <w:tblW w:w="13695" w:type="dxa"/>
         <w:tblLayout w:type="fixed"/>
         <w:tblLook w:val="0600" w:firstRow="0" w:lastRow="0" w:firstColumn="0" w:lastColumn="0" w:noHBand="1" w:noVBand="1"/>
       </w:tblPr>
       <w:tblGrid>
         <w:gridCol w:w="2730"/>
         <w:gridCol w:w="4005"/>
-        <w:gridCol w:w="3480"/>
+        <w:gridCol w:w="4155"/>
+        <w:gridCol w:w="2805"/>
       </w:tblGrid>
       <w:tr>
         <w:trPr>
@@ -73,6 +74,21 @@
                 <w:t>mpwester@gmail.com</w:t>
               </w:r>
             </w:hyperlink>
+            <w:r>
+              <w:rPr>
+                <w:rStyle w:val="Hyperlink"/>
+                <w:rFonts w:asciiTheme="majorHAnsi" w:hAnsiTheme="majorHAnsi" w:cstheme="majorHAnsi"/>
+              </w:rPr>
+              <w:br/>
+            </w:r>
+            <w:hyperlink r:id="rId9" w:history="1">
+              <w:r>
+                <w:rPr>
+                  <w:rStyle w:val="Hyperlink"/>
+                </w:rPr>
+                <w:t>Mike-Wester.github.io/</w:t>
+              </w:r>
+            </w:hyperlink>
           </w:p>
         </w:tc>
         <w:tc>
@@ -110,7 +126,99 @@
         </w:tc>
         <w:tc>
           <w:tcPr>
-            <w:tcW w:w="3480" w:type="dxa"/>
+            <w:tcW w:w="4155" w:type="dxa"/>
+          </w:tcPr>
+          <w:p>
+            <w:pPr>
+              <w:tabs>
+                <w:tab w:val="right" w:pos="10197"/>
+                <w:tab w:val="left" w:pos="10200"/>
+                <w:tab w:val="center" w:pos="4662"/>
+              </w:tabs>
+              <w:jc w:val="right"/>
+            </w:pPr>
+            <w:hyperlink r:id="rId10" w:history="1">
+              <w:r>
+                <w:rPr>
+                  <w:rStyle w:val="Hyperlink"/>
+                  <w:rFonts w:asciiTheme="majorHAnsi" w:hAnsiTheme="majorHAnsi" w:cstheme="majorHAnsi"/>
+                </w:rPr>
+                <w:t>L</w:t>
+              </w:r>
+              <w:r>
+                <w:rPr>
+                  <w:rStyle w:val="Hyperlink"/>
+                  <w:rFonts w:asciiTheme="majorHAnsi" w:hAnsiTheme="majorHAnsi" w:cstheme="majorHAnsi"/>
+                </w:rPr>
+                <w:t>inkedin.com/in/wester-</w:t>
+              </w:r>
+              <w:proofErr w:type="spellStart"/>
+              <w:r>
+                <w:rPr>
+                  <w:rStyle w:val="Hyperlink"/>
+                  <w:rFonts w:asciiTheme="majorHAnsi" w:hAnsiTheme="majorHAnsi" w:cstheme="majorHAnsi"/>
+                </w:rPr>
+                <w:t>michael</w:t>
+              </w:r>
+              <w:proofErr w:type="spellEnd"/>
+              <w:r>
+                <w:rPr>
+                  <w:rStyle w:val="Hyperlink"/>
+                  <w:rFonts w:asciiTheme="majorHAnsi" w:hAnsiTheme="majorHAnsi" w:cstheme="majorHAnsi"/>
+                </w:rPr>
+                <w:t>/</w:t>
+              </w:r>
+            </w:hyperlink>
+            <w:r>
+              <w:rPr>
+                <w:rFonts w:asciiTheme="majorHAnsi" w:hAnsiTheme="majorHAnsi" w:cstheme="majorHAnsi"/>
+              </w:rPr>
+              <w:t xml:space="preserve"> </w:t>
+            </w:r>
+            <w:hyperlink r:id="rId11" w:history="1">
+              <w:r>
+                <w:rPr>
+                  <w:rStyle w:val="Hyperlink"/>
+                  <w:rFonts w:asciiTheme="majorHAnsi" w:hAnsiTheme="majorHAnsi" w:cstheme="majorHAnsi"/>
+                </w:rPr>
+                <w:t>GitHub</w:t>
+              </w:r>
+              <w:r>
+                <w:rPr>
+                  <w:rStyle w:val="Hyperlink"/>
+                  <w:rFonts w:asciiTheme="majorHAnsi" w:hAnsiTheme="majorHAnsi" w:cstheme="majorHAnsi"/>
+                </w:rPr>
+                <w:t>.com/mike-wester</w:t>
+              </w:r>
+            </w:hyperlink>
+            <w:r>
+              <w:rPr>
+                <w:rStyle w:val="Hyperlink"/>
+                <w:rFonts w:asciiTheme="majorHAnsi" w:hAnsiTheme="majorHAnsi" w:cstheme="majorHAnsi"/>
+              </w:rPr>
+              <w:br/>
+            </w:r>
+            <w:hyperlink r:id="rId12" w:history="1">
+              <w:r>
+                <w:rPr>
+                  <w:rStyle w:val="Hyperlink"/>
+                </w:rPr>
+                <w:t>Codewars.com/users/</w:t>
+              </w:r>
+              <w:proofErr w:type="spellStart"/>
+              <w:r>
+                <w:rPr>
+                  <w:rStyle w:val="Hyperlink"/>
+                </w:rPr>
+                <w:t>mpwester</w:t>
+              </w:r>
+              <w:proofErr w:type="spellEnd"/>
+            </w:hyperlink>
+          </w:p>
+        </w:tc>
+        <w:tc>
+          <w:tcPr>
+            <w:tcW w:w="2805" w:type="dxa"/>
             <w:shd w:val="clear" w:color="auto" w:fill="auto"/>
             <w:tcMar>
               <w:top w:w="100" w:type="dxa"/>
@@ -126,56 +234,10 @@
                 <w:tab w:val="left" w:pos="10200"/>
                 <w:tab w:val="center" w:pos="4662"/>
               </w:tabs>
-              <w:jc w:val="right"/>
               <w:rPr>
                 <w:rFonts w:asciiTheme="majorHAnsi" w:hAnsiTheme="majorHAnsi" w:cstheme="majorHAnsi"/>
               </w:rPr>
             </w:pPr>
-            <w:hyperlink r:id="rId9" w:history="1">
-              <w:r>
-                <w:rPr>
-                  <w:rStyle w:val="Hyperlink"/>
-                  <w:rFonts w:asciiTheme="majorHAnsi" w:hAnsiTheme="majorHAnsi" w:cstheme="majorHAnsi"/>
-                </w:rPr>
-                <w:t>linkedin.com/in/wester-michael/</w:t>
-              </w:r>
-            </w:hyperlink>
-            <w:r>
-              <w:rPr>
-                <w:rFonts w:asciiTheme="majorHAnsi" w:hAnsiTheme="majorHAnsi" w:cstheme="majorHAnsi"/>
-              </w:rPr>
-              <w:t xml:space="preserve"> </w:t>
-            </w:r>
-            <w:hyperlink r:id="rId10" w:history="1">
-              <w:r>
-                <w:rPr>
-                  <w:rStyle w:val="Hyperlink"/>
-                  <w:rFonts w:asciiTheme="majorHAnsi" w:hAnsiTheme="majorHAnsi" w:cstheme="majorHAnsi"/>
-                </w:rPr>
-                <w:t>GitH</w:t>
-              </w:r>
-              <w:r>
-                <w:rPr>
-                  <w:rStyle w:val="Hyperlink"/>
-                  <w:rFonts w:asciiTheme="majorHAnsi" w:hAnsiTheme="majorHAnsi" w:cstheme="majorHAnsi"/>
-                </w:rPr>
-                <w:t>u</w:t>
-              </w:r>
-              <w:r>
-                <w:rPr>
-                  <w:rStyle w:val="Hyperlink"/>
-                  <w:rFonts w:asciiTheme="majorHAnsi" w:hAnsiTheme="majorHAnsi" w:cstheme="majorHAnsi"/>
-                </w:rPr>
-                <w:t>b</w:t>
-              </w:r>
-              <w:r>
-                <w:rPr>
-                  <w:rStyle w:val="Hyperlink"/>
-                  <w:rFonts w:asciiTheme="majorHAnsi" w:hAnsiTheme="majorHAnsi" w:cstheme="majorHAnsi"/>
-                </w:rPr>
-                <w:t>.com/mike-wester</w:t>
-              </w:r>
-            </w:hyperlink>
           </w:p>
         </w:tc>
       </w:tr>
@@ -2776,8 +2838,8 @@
       <w:bookmarkEnd w:id="1"/>
     </w:p>
     <w:sectPr>
-      <w:footerReference w:type="default" r:id="rId11"/>
-      <w:headerReference w:type="first" r:id="rId12"/>
+      <w:footerReference w:type="default" r:id="rId13"/>
+      <w:headerReference w:type="first" r:id="rId14"/>
       <w:pgSz w:w="12240" w:h="15840"/>
       <w:pgMar w:top="720" w:right="720" w:bottom="720" w:left="720" w:header="720" w:footer="0" w:gutter="0"/>
       <w:pgNumType w:start="2"/>

</xml_diff>